<commit_message>
docs: Ay 2 - 3. Hafta raporu tamamlandı
</commit_message>
<xml_diff>
--- a/ay2/raporlar/Ay2_Hafta3_Rapor.docx
+++ b/ay2/raporlar/Ay2_Hafta3_Rapor.docx
@@ -67,11 +67,15 @@
         <w:spacing w:after="100"/>
         <w:rPr>
           <w:color w:val="000000" w:themeColor="text1"/>
+          <w:sz w:val="22"/>
+          <w:szCs w:val="22"/>
         </w:rPr>
       </w:pPr>
       <w:r>
         <w:rPr>
           <w:color w:val="000000" w:themeColor="text1"/>
+          <w:sz w:val="22"/>
+          <w:szCs w:val="22"/>
         </w:rPr>
         <w:t>Pazartesi</w:t>
       </w:r>
@@ -81,11 +85,15 @@
         <w:spacing w:after="60"/>
         <w:rPr>
           <w:color w:val="000000" w:themeColor="text1"/>
+          <w:sz w:val="22"/>
+          <w:szCs w:val="22"/>
         </w:rPr>
       </w:pPr>
       <w:r>
         <w:rPr>
           <w:color w:val="000000" w:themeColor="text1"/>
+          <w:sz w:val="22"/>
+          <w:szCs w:val="22"/>
         </w:rPr>
         <w:t xml:space="preserve">- </w:t>
       </w:r>
@@ -93,6 +101,8 @@
       <w:r>
         <w:rPr>
           <w:color w:val="000000" w:themeColor="text1"/>
+          <w:sz w:val="22"/>
+          <w:szCs w:val="22"/>
         </w:rPr>
         <w:t>Singly</w:t>
       </w:r>
@@ -100,6 +110,8 @@
       <w:r>
         <w:rPr>
           <w:color w:val="000000" w:themeColor="text1"/>
+          <w:sz w:val="22"/>
+          <w:szCs w:val="22"/>
         </w:rPr>
         <w:t xml:space="preserve"> </w:t>
       </w:r>
@@ -107,6 +119,8 @@
       <w:r>
         <w:rPr>
           <w:color w:val="000000" w:themeColor="text1"/>
+          <w:sz w:val="22"/>
+          <w:szCs w:val="22"/>
         </w:rPr>
         <w:t>Linked</w:t>
       </w:r>
@@ -114,6 +128,8 @@
       <w:r>
         <w:rPr>
           <w:color w:val="000000" w:themeColor="text1"/>
+          <w:sz w:val="22"/>
+          <w:szCs w:val="22"/>
         </w:rPr>
         <w:t xml:space="preserve"> </w:t>
       </w:r>
@@ -121,6 +137,8 @@
       <w:r>
         <w:rPr>
           <w:color w:val="000000" w:themeColor="text1"/>
+          <w:sz w:val="22"/>
+          <w:szCs w:val="22"/>
         </w:rPr>
         <w:t>List</w:t>
       </w:r>
@@ -128,6 +146,8 @@
       <w:r>
         <w:rPr>
           <w:color w:val="000000" w:themeColor="text1"/>
+          <w:sz w:val="22"/>
+          <w:szCs w:val="22"/>
         </w:rPr>
         <w:t xml:space="preserve"> Python'da sıfırdan yazıldı: </w:t>
       </w:r>
@@ -135,6 +155,8 @@
       <w:r>
         <w:rPr>
           <w:color w:val="000000" w:themeColor="text1"/>
+          <w:sz w:val="22"/>
+          <w:szCs w:val="22"/>
         </w:rPr>
         <w:t>Node</w:t>
       </w:r>
@@ -142,6 +164,8 @@
       <w:r>
         <w:rPr>
           <w:color w:val="000000" w:themeColor="text1"/>
+          <w:sz w:val="22"/>
+          <w:szCs w:val="22"/>
         </w:rPr>
         <w:t xml:space="preserve"> ve </w:t>
       </w:r>
@@ -149,6 +173,8 @@
       <w:r>
         <w:rPr>
           <w:color w:val="000000" w:themeColor="text1"/>
+          <w:sz w:val="22"/>
+          <w:szCs w:val="22"/>
         </w:rPr>
         <w:t>LinkedList</w:t>
       </w:r>
@@ -156,6 +182,8 @@
       <w:r>
         <w:rPr>
           <w:color w:val="000000" w:themeColor="text1"/>
+          <w:sz w:val="22"/>
+          <w:szCs w:val="22"/>
         </w:rPr>
         <w:t xml:space="preserve"> sınıfları oluşturuldu; insert, </w:t>
       </w:r>
@@ -163,6 +191,8 @@
       <w:r>
         <w:rPr>
           <w:color w:val="000000" w:themeColor="text1"/>
+          <w:sz w:val="22"/>
+          <w:szCs w:val="22"/>
         </w:rPr>
         <w:t>search</w:t>
       </w:r>
@@ -170,6 +200,8 @@
       <w:r>
         <w:rPr>
           <w:color w:val="000000" w:themeColor="text1"/>
+          <w:sz w:val="22"/>
+          <w:szCs w:val="22"/>
         </w:rPr>
         <w:t xml:space="preserve">, </w:t>
       </w:r>
@@ -177,6 +209,8 @@
       <w:r>
         <w:rPr>
           <w:color w:val="000000" w:themeColor="text1"/>
+          <w:sz w:val="22"/>
+          <w:szCs w:val="22"/>
         </w:rPr>
         <w:t>delete</w:t>
       </w:r>
@@ -184,6 +218,8 @@
       <w:r>
         <w:rPr>
           <w:color w:val="000000" w:themeColor="text1"/>
+          <w:sz w:val="22"/>
+          <w:szCs w:val="22"/>
         </w:rPr>
         <w:t xml:space="preserve">, </w:t>
       </w:r>
@@ -191,6 +227,8 @@
       <w:r>
         <w:rPr>
           <w:color w:val="000000" w:themeColor="text1"/>
+          <w:sz w:val="22"/>
+          <w:szCs w:val="22"/>
         </w:rPr>
         <w:t>print_liste</w:t>
       </w:r>
@@ -198,6 +236,8 @@
       <w:r>
         <w:rPr>
           <w:color w:val="000000" w:themeColor="text1"/>
+          <w:sz w:val="22"/>
+          <w:szCs w:val="22"/>
         </w:rPr>
         <w:t xml:space="preserve"> ve </w:t>
       </w:r>
@@ -205,6 +245,8 @@
       <w:r>
         <w:rPr>
           <w:color w:val="000000" w:themeColor="text1"/>
+          <w:sz w:val="22"/>
+          <w:szCs w:val="22"/>
         </w:rPr>
         <w:t>reverse</w:t>
       </w:r>
@@ -212,6 +254,8 @@
       <w:r>
         <w:rPr>
           <w:color w:val="000000" w:themeColor="text1"/>
+          <w:sz w:val="22"/>
+          <w:szCs w:val="22"/>
         </w:rPr>
         <w:t xml:space="preserve"> </w:t>
       </w:r>
@@ -219,6 +263,8 @@
       <w:r>
         <w:rPr>
           <w:color w:val="000000" w:themeColor="text1"/>
+          <w:sz w:val="22"/>
+          <w:szCs w:val="22"/>
         </w:rPr>
         <w:t>metodları</w:t>
       </w:r>
@@ -226,6 +272,8 @@
       <w:r>
         <w:rPr>
           <w:color w:val="000000" w:themeColor="text1"/>
+          <w:sz w:val="22"/>
+          <w:szCs w:val="22"/>
         </w:rPr>
         <w:t xml:space="preserve"> </w:t>
       </w:r>
@@ -233,6 +281,8 @@
       <w:r>
         <w:rPr>
           <w:color w:val="000000" w:themeColor="text1"/>
+          <w:sz w:val="22"/>
+          <w:szCs w:val="22"/>
         </w:rPr>
         <w:t>implement</w:t>
       </w:r>
@@ -240,6 +290,8 @@
       <w:r>
         <w:rPr>
           <w:color w:val="000000" w:themeColor="text1"/>
+          <w:sz w:val="22"/>
+          <w:szCs w:val="22"/>
         </w:rPr>
         <w:t xml:space="preserve"> edildi.</w:t>
       </w:r>
@@ -249,11 +301,15 @@
         <w:spacing w:after="100"/>
         <w:rPr>
           <w:color w:val="000000" w:themeColor="text1"/>
+          <w:sz w:val="22"/>
+          <w:szCs w:val="22"/>
         </w:rPr>
       </w:pPr>
       <w:r>
         <w:rPr>
           <w:color w:val="000000" w:themeColor="text1"/>
+          <w:sz w:val="22"/>
+          <w:szCs w:val="22"/>
         </w:rPr>
         <w:t>Salı</w:t>
       </w:r>
@@ -263,11 +319,15 @@
         <w:spacing w:after="60"/>
         <w:rPr>
           <w:color w:val="000000" w:themeColor="text1"/>
+          <w:sz w:val="22"/>
+          <w:szCs w:val="22"/>
         </w:rPr>
       </w:pPr>
       <w:r>
         <w:rPr>
           <w:color w:val="000000" w:themeColor="text1"/>
+          <w:sz w:val="22"/>
+          <w:szCs w:val="22"/>
         </w:rPr>
         <w:t xml:space="preserve">- </w:t>
       </w:r>
@@ -275,6 +335,8 @@
       <w:r>
         <w:rPr>
           <w:color w:val="000000" w:themeColor="text1"/>
+          <w:sz w:val="22"/>
+          <w:szCs w:val="22"/>
         </w:rPr>
         <w:t>Singly</w:t>
       </w:r>
@@ -282,6 +344,8 @@
       <w:r>
         <w:rPr>
           <w:color w:val="000000" w:themeColor="text1"/>
+          <w:sz w:val="22"/>
+          <w:szCs w:val="22"/>
         </w:rPr>
         <w:t xml:space="preserve"> </w:t>
       </w:r>
@@ -289,6 +353,8 @@
       <w:r>
         <w:rPr>
           <w:color w:val="000000" w:themeColor="text1"/>
+          <w:sz w:val="22"/>
+          <w:szCs w:val="22"/>
         </w:rPr>
         <w:t>Linked</w:t>
       </w:r>
@@ -296,6 +362,8 @@
       <w:r>
         <w:rPr>
           <w:color w:val="000000" w:themeColor="text1"/>
+          <w:sz w:val="22"/>
+          <w:szCs w:val="22"/>
         </w:rPr>
         <w:t xml:space="preserve"> </w:t>
       </w:r>
@@ -303,6 +371,8 @@
       <w:r>
         <w:rPr>
           <w:color w:val="000000" w:themeColor="text1"/>
+          <w:sz w:val="22"/>
+          <w:szCs w:val="22"/>
         </w:rPr>
         <w:t>List</w:t>
       </w:r>
@@ -310,6 +380,8 @@
       <w:r>
         <w:rPr>
           <w:color w:val="000000" w:themeColor="text1"/>
+          <w:sz w:val="22"/>
+          <w:szCs w:val="22"/>
         </w:rPr>
         <w:t xml:space="preserve">, </w:t>
       </w:r>
@@ -317,6 +389,8 @@
       <w:r>
         <w:rPr>
           <w:color w:val="000000" w:themeColor="text1"/>
+          <w:sz w:val="22"/>
+          <w:szCs w:val="22"/>
         </w:rPr>
         <w:t>Doubly</w:t>
       </w:r>
@@ -324,6 +398,8 @@
       <w:r>
         <w:rPr>
           <w:color w:val="000000" w:themeColor="text1"/>
+          <w:sz w:val="22"/>
+          <w:szCs w:val="22"/>
         </w:rPr>
         <w:t xml:space="preserve"> </w:t>
       </w:r>
@@ -331,6 +407,8 @@
       <w:r>
         <w:rPr>
           <w:color w:val="000000" w:themeColor="text1"/>
+          <w:sz w:val="22"/>
+          <w:szCs w:val="22"/>
         </w:rPr>
         <w:t>Linked</w:t>
       </w:r>
@@ -338,6 +416,8 @@
       <w:r>
         <w:rPr>
           <w:color w:val="000000" w:themeColor="text1"/>
+          <w:sz w:val="22"/>
+          <w:szCs w:val="22"/>
         </w:rPr>
         <w:t xml:space="preserve"> </w:t>
       </w:r>
@@ -345,6 +425,8 @@
       <w:r>
         <w:rPr>
           <w:color w:val="000000" w:themeColor="text1"/>
+          <w:sz w:val="22"/>
+          <w:szCs w:val="22"/>
         </w:rPr>
         <w:t>List'e</w:t>
       </w:r>
@@ -352,6 +434,8 @@
       <w:r>
         <w:rPr>
           <w:color w:val="000000" w:themeColor="text1"/>
+          <w:sz w:val="22"/>
+          <w:szCs w:val="22"/>
         </w:rPr>
         <w:t xml:space="preserve"> dönüştürüldü: </w:t>
       </w:r>
@@ -359,6 +443,8 @@
       <w:r>
         <w:rPr>
           <w:color w:val="000000" w:themeColor="text1"/>
+          <w:sz w:val="22"/>
+          <w:szCs w:val="22"/>
         </w:rPr>
         <w:t>Node</w:t>
       </w:r>
@@ -366,6 +452,8 @@
       <w:r>
         <w:rPr>
           <w:color w:val="000000" w:themeColor="text1"/>
+          <w:sz w:val="22"/>
+          <w:szCs w:val="22"/>
         </w:rPr>
         <w:t xml:space="preserve"> sınıfına </w:t>
       </w:r>
@@ -373,6 +461,8 @@
       <w:r>
         <w:rPr>
           <w:color w:val="000000" w:themeColor="text1"/>
+          <w:sz w:val="22"/>
+          <w:szCs w:val="22"/>
         </w:rPr>
         <w:t>prev</w:t>
       </w:r>
@@ -380,6 +470,8 @@
       <w:r>
         <w:rPr>
           <w:color w:val="000000" w:themeColor="text1"/>
+          <w:sz w:val="22"/>
+          <w:szCs w:val="22"/>
         </w:rPr>
         <w:t xml:space="preserve"> referansı, </w:t>
       </w:r>
@@ -387,6 +479,8 @@
       <w:r>
         <w:rPr>
           <w:color w:val="000000" w:themeColor="text1"/>
+          <w:sz w:val="22"/>
+          <w:szCs w:val="22"/>
         </w:rPr>
         <w:t>LinkedList</w:t>
       </w:r>
@@ -394,6 +488,8 @@
       <w:r>
         <w:rPr>
           <w:color w:val="000000" w:themeColor="text1"/>
+          <w:sz w:val="22"/>
+          <w:szCs w:val="22"/>
         </w:rPr>
         <w:t xml:space="preserve"> sınıfına </w:t>
       </w:r>
@@ -401,6 +497,8 @@
       <w:r>
         <w:rPr>
           <w:color w:val="000000" w:themeColor="text1"/>
+          <w:sz w:val="22"/>
+          <w:szCs w:val="22"/>
         </w:rPr>
         <w:t>tail</w:t>
       </w:r>
@@ -408,6 +506,8 @@
       <w:r>
         <w:rPr>
           <w:color w:val="000000" w:themeColor="text1"/>
+          <w:sz w:val="22"/>
+          <w:szCs w:val="22"/>
         </w:rPr>
         <w:t xml:space="preserve"> referansı eklendi. </w:t>
       </w:r>
@@ -415,6 +515,8 @@
       <w:r>
         <w:rPr>
           <w:color w:val="000000" w:themeColor="text1"/>
+          <w:sz w:val="22"/>
+          <w:szCs w:val="22"/>
         </w:rPr>
         <w:t>insert</w:t>
       </w:r>
@@ -422,6 +524,8 @@
       <w:r>
         <w:rPr>
           <w:color w:val="000000" w:themeColor="text1"/>
+          <w:sz w:val="22"/>
+          <w:szCs w:val="22"/>
         </w:rPr>
         <w:t xml:space="preserve">, </w:t>
       </w:r>
@@ -429,6 +533,8 @@
       <w:r>
         <w:rPr>
           <w:color w:val="000000" w:themeColor="text1"/>
+          <w:sz w:val="22"/>
+          <w:szCs w:val="22"/>
         </w:rPr>
         <w:t>delete</w:t>
       </w:r>
@@ -436,6 +542,8 @@
       <w:r>
         <w:rPr>
           <w:color w:val="000000" w:themeColor="text1"/>
+          <w:sz w:val="22"/>
+          <w:szCs w:val="22"/>
         </w:rPr>
         <w:t xml:space="preserve"> ve </w:t>
       </w:r>
@@ -443,6 +551,8 @@
       <w:r>
         <w:rPr>
           <w:color w:val="000000" w:themeColor="text1"/>
+          <w:sz w:val="22"/>
+          <w:szCs w:val="22"/>
         </w:rPr>
         <w:t>reverse</w:t>
       </w:r>
@@ -450,6 +560,8 @@
       <w:r>
         <w:rPr>
           <w:color w:val="000000" w:themeColor="text1"/>
+          <w:sz w:val="22"/>
+          <w:szCs w:val="22"/>
         </w:rPr>
         <w:t xml:space="preserve"> </w:t>
       </w:r>
@@ -457,6 +569,8 @@
       <w:r>
         <w:rPr>
           <w:color w:val="000000" w:themeColor="text1"/>
+          <w:sz w:val="22"/>
+          <w:szCs w:val="22"/>
         </w:rPr>
         <w:t>metodları</w:t>
       </w:r>
@@ -464,6 +578,8 @@
       <w:r>
         <w:rPr>
           <w:color w:val="000000" w:themeColor="text1"/>
+          <w:sz w:val="22"/>
+          <w:szCs w:val="22"/>
         </w:rPr>
         <w:t xml:space="preserve"> çift yönlü bağlantıyı destekleyecek şekilde güncellendi.</w:t>
       </w:r>
@@ -473,17 +589,23 @@
         <w:spacing w:after="100"/>
         <w:rPr>
           <w:color w:val="000000" w:themeColor="text1"/>
+          <w:sz w:val="22"/>
+          <w:szCs w:val="22"/>
         </w:rPr>
       </w:pPr>
       <w:r>
         <w:rPr>
           <w:color w:val="000000" w:themeColor="text1"/>
+          <w:sz w:val="22"/>
+          <w:szCs w:val="22"/>
         </w:rPr>
         <w:t>Çarşamba</w:t>
       </w:r>
       <w:r>
         <w:rPr>
           <w:color w:val="000000" w:themeColor="text1"/>
+          <w:sz w:val="22"/>
+          <w:szCs w:val="22"/>
         </w:rPr>
         <w:t>-Perşembe</w:t>
       </w:r>
@@ -493,11 +615,15 @@
         <w:spacing w:after="60"/>
         <w:rPr>
           <w:color w:val="000000" w:themeColor="text1"/>
+          <w:sz w:val="22"/>
+          <w:szCs w:val="22"/>
         </w:rPr>
       </w:pPr>
       <w:r>
         <w:rPr>
           <w:color w:val="000000" w:themeColor="text1"/>
+          <w:sz w:val="22"/>
+          <w:szCs w:val="22"/>
         </w:rPr>
         <w:t xml:space="preserve">- </w:t>
       </w:r>
@@ -505,6 +631,8 @@
       <w:r>
         <w:rPr>
           <w:color w:val="000000" w:themeColor="text1"/>
+          <w:sz w:val="22"/>
+          <w:szCs w:val="22"/>
         </w:rPr>
         <w:t>Binary</w:t>
       </w:r>
@@ -512,6 +640,8 @@
       <w:r>
         <w:rPr>
           <w:color w:val="000000" w:themeColor="text1"/>
+          <w:sz w:val="22"/>
+          <w:szCs w:val="22"/>
         </w:rPr>
         <w:t xml:space="preserve"> </w:t>
       </w:r>
@@ -519,6 +649,8 @@
       <w:r>
         <w:rPr>
           <w:color w:val="000000" w:themeColor="text1"/>
+          <w:sz w:val="22"/>
+          <w:szCs w:val="22"/>
         </w:rPr>
         <w:t>Search</w:t>
       </w:r>
@@ -526,6 +658,8 @@
       <w:r>
         <w:rPr>
           <w:color w:val="000000" w:themeColor="text1"/>
+          <w:sz w:val="22"/>
+          <w:szCs w:val="22"/>
         </w:rPr>
         <w:t xml:space="preserve"> </w:t>
       </w:r>
@@ -533,6 +667,8 @@
       <w:r>
         <w:rPr>
           <w:color w:val="000000" w:themeColor="text1"/>
+          <w:sz w:val="22"/>
+          <w:szCs w:val="22"/>
         </w:rPr>
         <w:t>Tree</w:t>
       </w:r>
@@ -540,6 +676,8 @@
       <w:r>
         <w:rPr>
           <w:color w:val="000000" w:themeColor="text1"/>
+          <w:sz w:val="22"/>
+          <w:szCs w:val="22"/>
         </w:rPr>
         <w:t xml:space="preserve"> implementasyonu yapıldı: </w:t>
       </w:r>
@@ -547,6 +685,8 @@
       <w:r>
         <w:rPr>
           <w:color w:val="000000" w:themeColor="text1"/>
+          <w:sz w:val="22"/>
+          <w:szCs w:val="22"/>
         </w:rPr>
         <w:t>TreeNode</w:t>
       </w:r>
@@ -554,6 +694,8 @@
       <w:r>
         <w:rPr>
           <w:color w:val="000000" w:themeColor="text1"/>
+          <w:sz w:val="22"/>
+          <w:szCs w:val="22"/>
         </w:rPr>
         <w:t xml:space="preserve"> ve </w:t>
       </w:r>
@@ -561,6 +703,8 @@
       <w:r>
         <w:rPr>
           <w:color w:val="000000" w:themeColor="text1"/>
+          <w:sz w:val="22"/>
+          <w:szCs w:val="22"/>
         </w:rPr>
         <w:t>BinaryTree</w:t>
       </w:r>
@@ -568,6 +712,8 @@
       <w:r>
         <w:rPr>
           <w:color w:val="000000" w:themeColor="text1"/>
+          <w:sz w:val="22"/>
+          <w:szCs w:val="22"/>
         </w:rPr>
         <w:t xml:space="preserve"> sınıfları yazıldı, insert metodu BST kuralına göre (küçük sola, büyük veya eşit sağa) çalışıyor. </w:t>
       </w:r>
@@ -576,6 +722,8 @@
       <w:r>
         <w:rPr>
           <w:color w:val="000000" w:themeColor="text1"/>
+          <w:sz w:val="22"/>
+          <w:szCs w:val="22"/>
         </w:rPr>
         <w:t>inorder</w:t>
       </w:r>
@@ -584,6 +732,8 @@
       <w:r>
         <w:rPr>
           <w:color w:val="000000" w:themeColor="text1"/>
+          <w:sz w:val="22"/>
+          <w:szCs w:val="22"/>
         </w:rPr>
         <w:t xml:space="preserve">, </w:t>
       </w:r>
@@ -591,6 +741,8 @@
       <w:r>
         <w:rPr>
           <w:color w:val="000000" w:themeColor="text1"/>
+          <w:sz w:val="22"/>
+          <w:szCs w:val="22"/>
         </w:rPr>
         <w:t>preorder</w:t>
       </w:r>
@@ -598,6 +750,8 @@
       <w:r>
         <w:rPr>
           <w:color w:val="000000" w:themeColor="text1"/>
+          <w:sz w:val="22"/>
+          <w:szCs w:val="22"/>
         </w:rPr>
         <w:t xml:space="preserve">, </w:t>
       </w:r>
@@ -605,6 +759,8 @@
       <w:r>
         <w:rPr>
           <w:color w:val="000000" w:themeColor="text1"/>
+          <w:sz w:val="22"/>
+          <w:szCs w:val="22"/>
         </w:rPr>
         <w:t>postorder</w:t>
       </w:r>
@@ -612,6 +768,8 @@
       <w:r>
         <w:rPr>
           <w:color w:val="000000" w:themeColor="text1"/>
+          <w:sz w:val="22"/>
+          <w:szCs w:val="22"/>
         </w:rPr>
         <w:t xml:space="preserve"> </w:t>
       </w:r>
@@ -619,6 +777,8 @@
       <w:r>
         <w:rPr>
           <w:color w:val="000000" w:themeColor="text1"/>
+          <w:sz w:val="22"/>
+          <w:szCs w:val="22"/>
         </w:rPr>
         <w:t>traversal</w:t>
       </w:r>
@@ -626,6 +786,8 @@
       <w:r>
         <w:rPr>
           <w:color w:val="000000" w:themeColor="text1"/>
+          <w:sz w:val="22"/>
+          <w:szCs w:val="22"/>
         </w:rPr>
         <w:t xml:space="preserve"> metotları </w:t>
       </w:r>
@@ -633,6 +795,8 @@
       <w:r>
         <w:rPr>
           <w:color w:val="000000" w:themeColor="text1"/>
+          <w:sz w:val="22"/>
+          <w:szCs w:val="22"/>
         </w:rPr>
         <w:t>recursive</w:t>
       </w:r>
@@ -640,6 +804,8 @@
       <w:r>
         <w:rPr>
           <w:color w:val="000000" w:themeColor="text1"/>
+          <w:sz w:val="22"/>
+          <w:szCs w:val="22"/>
         </w:rPr>
         <w:t xml:space="preserve"> olarak </w:t>
       </w:r>
@@ -647,6 +813,8 @@
       <w:r>
         <w:rPr>
           <w:color w:val="000000" w:themeColor="text1"/>
+          <w:sz w:val="22"/>
+          <w:szCs w:val="22"/>
         </w:rPr>
         <w:t>implement</w:t>
       </w:r>
@@ -654,6 +822,8 @@
       <w:r>
         <w:rPr>
           <w:color w:val="000000" w:themeColor="text1"/>
+          <w:sz w:val="22"/>
+          <w:szCs w:val="22"/>
         </w:rPr>
         <w:t xml:space="preserve"> edildi.</w:t>
       </w:r>
@@ -663,11 +833,15 @@
         <w:spacing w:after="100"/>
         <w:rPr>
           <w:color w:val="000000" w:themeColor="text1"/>
+          <w:sz w:val="22"/>
+          <w:szCs w:val="22"/>
         </w:rPr>
       </w:pPr>
       <w:r>
         <w:rPr>
           <w:color w:val="000000" w:themeColor="text1"/>
+          <w:sz w:val="22"/>
+          <w:szCs w:val="22"/>
         </w:rPr>
         <w:t>Cuma</w:t>
       </w:r>
@@ -677,11 +851,15 @@
         <w:spacing w:after="60"/>
         <w:rPr>
           <w:color w:val="000000" w:themeColor="text1"/>
+          <w:sz w:val="22"/>
+          <w:szCs w:val="22"/>
         </w:rPr>
       </w:pPr>
       <w:r>
         <w:rPr>
           <w:color w:val="000000" w:themeColor="text1"/>
+          <w:sz w:val="22"/>
+          <w:szCs w:val="22"/>
         </w:rPr>
         <w:t xml:space="preserve">- </w:t>
       </w:r>
@@ -689,6 +867,8 @@
       <w:r>
         <w:rPr>
           <w:color w:val="000000" w:themeColor="text1"/>
+          <w:sz w:val="22"/>
+          <w:szCs w:val="22"/>
         </w:rPr>
         <w:t>LeetCode</w:t>
       </w:r>
@@ -696,6 +876,8 @@
       <w:r>
         <w:rPr>
           <w:color w:val="000000" w:themeColor="text1"/>
+          <w:sz w:val="22"/>
+          <w:szCs w:val="22"/>
         </w:rPr>
         <w:t xml:space="preserve">: </w:t>
       </w:r>
@@ -703,6 +885,8 @@
       <w:r>
         <w:rPr>
           <w:color w:val="000000" w:themeColor="text1"/>
+          <w:sz w:val="22"/>
+          <w:szCs w:val="22"/>
         </w:rPr>
         <w:t>160 -</w:t>
       </w:r>
@@ -710,6 +894,8 @@
       <w:r>
         <w:rPr>
           <w:color w:val="000000" w:themeColor="text1"/>
+          <w:sz w:val="22"/>
+          <w:szCs w:val="22"/>
         </w:rPr>
         <w:t xml:space="preserve"> </w:t>
       </w:r>
@@ -717,6 +903,8 @@
       <w:r>
         <w:rPr>
           <w:color w:val="000000" w:themeColor="text1"/>
+          <w:sz w:val="22"/>
+          <w:szCs w:val="22"/>
         </w:rPr>
         <w:t>Intersection</w:t>
       </w:r>
@@ -724,6 +912,8 @@
       <w:r>
         <w:rPr>
           <w:color w:val="000000" w:themeColor="text1"/>
+          <w:sz w:val="22"/>
+          <w:szCs w:val="22"/>
         </w:rPr>
         <w:t xml:space="preserve"> of Two </w:t>
       </w:r>
@@ -731,6 +921,8 @@
       <w:r>
         <w:rPr>
           <w:color w:val="000000" w:themeColor="text1"/>
+          <w:sz w:val="22"/>
+          <w:szCs w:val="22"/>
         </w:rPr>
         <w:t>Linked</w:t>
       </w:r>
@@ -738,6 +930,8 @@
       <w:r>
         <w:rPr>
           <w:color w:val="000000" w:themeColor="text1"/>
+          <w:sz w:val="22"/>
+          <w:szCs w:val="22"/>
         </w:rPr>
         <w:t xml:space="preserve"> </w:t>
       </w:r>
@@ -745,6 +939,8 @@
       <w:r>
         <w:rPr>
           <w:color w:val="000000" w:themeColor="text1"/>
+          <w:sz w:val="22"/>
+          <w:szCs w:val="22"/>
         </w:rPr>
         <w:t>Lists</w:t>
       </w:r>
@@ -752,6 +948,8 @@
       <w:r>
         <w:rPr>
           <w:color w:val="000000" w:themeColor="text1"/>
+          <w:sz w:val="22"/>
+          <w:szCs w:val="22"/>
         </w:rPr>
         <w:t xml:space="preserve"> (</w:t>
       </w:r>
@@ -759,16 +957,487 @@
       <w:r>
         <w:rPr>
           <w:color w:val="000000" w:themeColor="text1"/>
-        </w:rPr>
-        <w:t>Easy</w:t>
-      </w:r>
-      <w:proofErr w:type="spellEnd"/>
-      <w:r>
-        <w:rPr>
-          <w:color w:val="000000" w:themeColor="text1"/>
+          <w:sz w:val="22"/>
+          <w:szCs w:val="22"/>
+        </w:rPr>
+        <w:t>e</w:t>
+      </w:r>
+      <w:r>
+        <w:rPr>
+          <w:color w:val="000000" w:themeColor="text1"/>
+          <w:sz w:val="22"/>
+          <w:szCs w:val="22"/>
+        </w:rPr>
+        <w:t>asy</w:t>
+      </w:r>
+      <w:proofErr w:type="spellEnd"/>
+      <w:r>
+        <w:rPr>
+          <w:color w:val="000000" w:themeColor="text1"/>
+          <w:sz w:val="22"/>
+          <w:szCs w:val="22"/>
         </w:rPr>
         <w:t>) problemi çözüldü, iki işaretçi tekniği öğrenildi.</w:t>
       </w:r>
+    </w:p>
+    <w:p>
+      <w:pPr>
+        <w:spacing w:after="60"/>
+        <w:rPr>
+          <w:color w:val="000000" w:themeColor="text1"/>
+          <w:sz w:val="22"/>
+          <w:szCs w:val="22"/>
+        </w:rPr>
+      </w:pPr>
+      <w:r>
+        <w:rPr>
+          <w:color w:val="000000" w:themeColor="text1"/>
+          <w:sz w:val="22"/>
+          <w:szCs w:val="22"/>
+        </w:rPr>
+        <w:t xml:space="preserve">Cumartesi </w:t>
+      </w:r>
+    </w:p>
+    <w:p>
+      <w:pPr>
+        <w:spacing w:after="60"/>
+        <w:rPr>
+          <w:color w:val="000000" w:themeColor="text1"/>
+          <w:sz w:val="22"/>
+          <w:szCs w:val="22"/>
+        </w:rPr>
+      </w:pPr>
+      <w:r>
+        <w:rPr>
+          <w:color w:val="000000" w:themeColor="text1"/>
+          <w:sz w:val="22"/>
+          <w:szCs w:val="22"/>
+        </w:rPr>
+        <w:t xml:space="preserve">- Teknik kaynak </w:t>
+      </w:r>
+      <w:proofErr w:type="gramStart"/>
+      <w:r>
+        <w:rPr>
+          <w:color w:val="000000" w:themeColor="text1"/>
+          <w:sz w:val="22"/>
+          <w:szCs w:val="22"/>
+        </w:rPr>
+        <w:t>okundu ,özetlendi</w:t>
+      </w:r>
+      <w:proofErr w:type="gramEnd"/>
+      <w:r>
+        <w:rPr>
+          <w:color w:val="000000" w:themeColor="text1"/>
+          <w:sz w:val="22"/>
+          <w:szCs w:val="22"/>
+        </w:rPr>
+        <w:t>.</w:t>
+      </w:r>
+    </w:p>
+    <w:p>
+      <w:pPr>
+        <w:spacing w:after="100"/>
+        <w:rPr>
+          <w:sz w:val="22"/>
+          <w:szCs w:val="22"/>
+        </w:rPr>
+      </w:pPr>
+      <w:r>
+        <w:rPr>
+          <w:color w:val="000000" w:themeColor="text1"/>
+          <w:sz w:val="22"/>
+          <w:szCs w:val="22"/>
+        </w:rPr>
+        <w:t>-</w:t>
+      </w:r>
+      <w:proofErr w:type="spellStart"/>
+      <w:r>
+        <w:rPr>
+          <w:sz w:val="22"/>
+          <w:szCs w:val="22"/>
+        </w:rPr>
+        <w:fldChar w:fldCharType="begin"/>
+      </w:r>
+      <w:r>
+        <w:rPr>
+          <w:sz w:val="22"/>
+          <w:szCs w:val="22"/>
+        </w:rPr>
+        <w:instrText>HYPERLINK "https://leetcode.com/problems/remove-linked-list-elements/description/"</w:instrText>
+      </w:r>
+      <w:r>
+        <w:rPr>
+          <w:sz w:val="22"/>
+          <w:szCs w:val="22"/>
+        </w:rPr>
+      </w:r>
+      <w:r>
+        <w:rPr>
+          <w:sz w:val="22"/>
+          <w:szCs w:val="22"/>
+        </w:rPr>
+        <w:fldChar w:fldCharType="separate"/>
+      </w:r>
+      <w:r>
+        <w:rPr>
+          <w:rStyle w:val="Kpr"/>
+          <w:color w:val="auto"/>
+          <w:sz w:val="22"/>
+          <w:szCs w:val="22"/>
+        </w:rPr>
+        <w:t>LeetCode</w:t>
+      </w:r>
+      <w:proofErr w:type="spellEnd"/>
+      <w:r>
+        <w:rPr>
+          <w:rStyle w:val="Kpr"/>
+          <w:color w:val="auto"/>
+          <w:sz w:val="22"/>
+          <w:szCs w:val="22"/>
+        </w:rPr>
+        <w:t xml:space="preserve"> </w:t>
+      </w:r>
+      <w:proofErr w:type="gramStart"/>
+      <w:r>
+        <w:rPr>
+          <w:rStyle w:val="Kpr"/>
+          <w:color w:val="auto"/>
+          <w:sz w:val="22"/>
+          <w:szCs w:val="22"/>
+        </w:rPr>
+        <w:t>203 -</w:t>
+      </w:r>
+      <w:proofErr w:type="gramEnd"/>
+      <w:r>
+        <w:rPr>
+          <w:rStyle w:val="Kpr"/>
+          <w:color w:val="auto"/>
+          <w:sz w:val="22"/>
+          <w:szCs w:val="22"/>
+        </w:rPr>
+        <w:t xml:space="preserve"> </w:t>
+      </w:r>
+      <w:proofErr w:type="spellStart"/>
+      <w:r>
+        <w:rPr>
+          <w:rStyle w:val="Kpr"/>
+          <w:color w:val="auto"/>
+          <w:sz w:val="22"/>
+          <w:szCs w:val="22"/>
+        </w:rPr>
+        <w:t>Remove</w:t>
+      </w:r>
+      <w:proofErr w:type="spellEnd"/>
+      <w:r>
+        <w:rPr>
+          <w:rStyle w:val="Kpr"/>
+          <w:color w:val="auto"/>
+          <w:sz w:val="22"/>
+          <w:szCs w:val="22"/>
+        </w:rPr>
+        <w:t xml:space="preserve"> </w:t>
+      </w:r>
+      <w:proofErr w:type="spellStart"/>
+      <w:r>
+        <w:rPr>
+          <w:rStyle w:val="Kpr"/>
+          <w:color w:val="auto"/>
+          <w:sz w:val="22"/>
+          <w:szCs w:val="22"/>
+        </w:rPr>
+        <w:t>Linked</w:t>
+      </w:r>
+      <w:proofErr w:type="spellEnd"/>
+      <w:r>
+        <w:rPr>
+          <w:rStyle w:val="Kpr"/>
+          <w:color w:val="auto"/>
+          <w:sz w:val="22"/>
+          <w:szCs w:val="22"/>
+        </w:rPr>
+        <w:t xml:space="preserve"> </w:t>
+      </w:r>
+      <w:proofErr w:type="spellStart"/>
+      <w:r>
+        <w:rPr>
+          <w:rStyle w:val="Kpr"/>
+          <w:color w:val="auto"/>
+          <w:sz w:val="22"/>
+          <w:szCs w:val="22"/>
+        </w:rPr>
+        <w:t>List</w:t>
+      </w:r>
+      <w:proofErr w:type="spellEnd"/>
+      <w:r>
+        <w:rPr>
+          <w:rStyle w:val="Kpr"/>
+          <w:color w:val="auto"/>
+          <w:sz w:val="22"/>
+          <w:szCs w:val="22"/>
+        </w:rPr>
+        <w:t xml:space="preserve"> </w:t>
+      </w:r>
+      <w:proofErr w:type="spellStart"/>
+      <w:r>
+        <w:rPr>
+          <w:rStyle w:val="Kpr"/>
+          <w:color w:val="auto"/>
+          <w:sz w:val="22"/>
+          <w:szCs w:val="22"/>
+        </w:rPr>
+        <w:t>Elements</w:t>
+      </w:r>
+      <w:proofErr w:type="spellEnd"/>
+      <w:r>
+        <w:rPr>
+          <w:sz w:val="22"/>
+          <w:szCs w:val="22"/>
+        </w:rPr>
+        <w:fldChar w:fldCharType="end"/>
+      </w:r>
+      <w:r>
+        <w:rPr>
+          <w:sz w:val="22"/>
+          <w:szCs w:val="22"/>
+        </w:rPr>
+        <w:t>(</w:t>
+      </w:r>
+      <w:proofErr w:type="spellStart"/>
+      <w:r>
+        <w:rPr>
+          <w:sz w:val="22"/>
+          <w:szCs w:val="22"/>
+        </w:rPr>
+        <w:t>easy</w:t>
+      </w:r>
+      <w:proofErr w:type="spellEnd"/>
+      <w:r>
+        <w:rPr>
+          <w:sz w:val="22"/>
+          <w:szCs w:val="22"/>
+        </w:rPr>
+        <w:t>) problemi çözüldü.</w:t>
+      </w:r>
+    </w:p>
+    <w:p>
+      <w:pPr>
+        <w:spacing w:after="100"/>
+        <w:rPr>
+          <w:sz w:val="22"/>
+          <w:szCs w:val="22"/>
+        </w:rPr>
+      </w:pPr>
+      <w:r>
+        <w:rPr>
+          <w:sz w:val="22"/>
+          <w:szCs w:val="22"/>
+        </w:rPr>
+        <w:t>Pazar</w:t>
+      </w:r>
+    </w:p>
+    <w:p>
+      <w:pPr>
+        <w:spacing w:after="100"/>
+        <w:rPr>
+          <w:sz w:val="22"/>
+          <w:szCs w:val="22"/>
+        </w:rPr>
+      </w:pPr>
+      <w:r>
+        <w:rPr>
+          <w:sz w:val="22"/>
+          <w:szCs w:val="22"/>
+        </w:rPr>
+        <w:t>-</w:t>
+      </w:r>
+      <w:hyperlink r:id="rId5" w:history="1">
+        <w:r>
+          <w:rPr>
+            <w:rStyle w:val="Kpr"/>
+            <w:color w:val="auto"/>
+            <w:sz w:val="22"/>
+            <w:szCs w:val="22"/>
+          </w:rPr>
+          <w:t xml:space="preserve"> </w:t>
+        </w:r>
+        <w:proofErr w:type="spellStart"/>
+        <w:r>
+          <w:rPr>
+            <w:rStyle w:val="Kpr"/>
+            <w:color w:val="auto"/>
+            <w:sz w:val="22"/>
+            <w:szCs w:val="22"/>
+          </w:rPr>
+          <w:t>LeetCode</w:t>
+        </w:r>
+        <w:proofErr w:type="spellEnd"/>
+        <w:r>
+          <w:rPr>
+            <w:rStyle w:val="Kpr"/>
+            <w:color w:val="auto"/>
+            <w:sz w:val="22"/>
+            <w:szCs w:val="22"/>
+          </w:rPr>
+          <w:t xml:space="preserve"> </w:t>
+        </w:r>
+        <w:proofErr w:type="gramStart"/>
+        <w:r>
+          <w:rPr>
+            <w:rStyle w:val="Kpr"/>
+            <w:color w:val="auto"/>
+            <w:sz w:val="22"/>
+            <w:szCs w:val="22"/>
+          </w:rPr>
+          <w:t>700 -</w:t>
+        </w:r>
+        <w:proofErr w:type="gramEnd"/>
+        <w:r>
+          <w:rPr>
+            <w:rStyle w:val="Kpr"/>
+            <w:color w:val="auto"/>
+            <w:sz w:val="22"/>
+            <w:szCs w:val="22"/>
+          </w:rPr>
+          <w:t xml:space="preserve"> </w:t>
+        </w:r>
+        <w:proofErr w:type="spellStart"/>
+        <w:r>
+          <w:rPr>
+            <w:rStyle w:val="Kpr"/>
+            <w:color w:val="auto"/>
+            <w:sz w:val="22"/>
+            <w:szCs w:val="22"/>
+          </w:rPr>
+          <w:t>Search</w:t>
+        </w:r>
+        <w:proofErr w:type="spellEnd"/>
+        <w:r>
+          <w:rPr>
+            <w:rStyle w:val="Kpr"/>
+            <w:color w:val="auto"/>
+            <w:sz w:val="22"/>
+            <w:szCs w:val="22"/>
+          </w:rPr>
+          <w:t xml:space="preserve"> in a </w:t>
+        </w:r>
+        <w:proofErr w:type="spellStart"/>
+        <w:r>
+          <w:rPr>
+            <w:rStyle w:val="Kpr"/>
+            <w:color w:val="auto"/>
+            <w:sz w:val="22"/>
+            <w:szCs w:val="22"/>
+          </w:rPr>
+          <w:t>Binary</w:t>
+        </w:r>
+        <w:proofErr w:type="spellEnd"/>
+        <w:r>
+          <w:rPr>
+            <w:rStyle w:val="Kpr"/>
+            <w:color w:val="auto"/>
+            <w:sz w:val="22"/>
+            <w:szCs w:val="22"/>
+          </w:rPr>
+          <w:t xml:space="preserve"> </w:t>
+        </w:r>
+        <w:proofErr w:type="spellStart"/>
+        <w:r>
+          <w:rPr>
+            <w:rStyle w:val="Kpr"/>
+            <w:color w:val="auto"/>
+            <w:sz w:val="22"/>
+            <w:szCs w:val="22"/>
+          </w:rPr>
+          <w:t>Search</w:t>
+        </w:r>
+        <w:proofErr w:type="spellEnd"/>
+        <w:r>
+          <w:rPr>
+            <w:rStyle w:val="Kpr"/>
+            <w:color w:val="auto"/>
+            <w:sz w:val="22"/>
+            <w:szCs w:val="22"/>
+          </w:rPr>
+          <w:t xml:space="preserve"> </w:t>
+        </w:r>
+        <w:proofErr w:type="spellStart"/>
+        <w:r>
+          <w:rPr>
+            <w:rStyle w:val="Kpr"/>
+            <w:color w:val="auto"/>
+            <w:sz w:val="22"/>
+            <w:szCs w:val="22"/>
+          </w:rPr>
+          <w:t>Tree</w:t>
+        </w:r>
+        <w:proofErr w:type="spellEnd"/>
+      </w:hyperlink>
+      <w:r>
+        <w:rPr>
+          <w:sz w:val="22"/>
+          <w:szCs w:val="22"/>
+        </w:rPr>
+        <w:t xml:space="preserve"> (</w:t>
+      </w:r>
+      <w:proofErr w:type="spellStart"/>
+      <w:r>
+        <w:rPr>
+          <w:sz w:val="22"/>
+          <w:szCs w:val="22"/>
+        </w:rPr>
+        <w:t>easy</w:t>
+      </w:r>
+      <w:proofErr w:type="spellEnd"/>
+      <w:r>
+        <w:rPr>
+          <w:sz w:val="22"/>
+          <w:szCs w:val="22"/>
+        </w:rPr>
+        <w:t xml:space="preserve">) problemi </w:t>
+      </w:r>
+      <w:proofErr w:type="gramStart"/>
+      <w:r>
+        <w:rPr>
+          <w:sz w:val="22"/>
+          <w:szCs w:val="22"/>
+        </w:rPr>
+        <w:t>çözüldü .</w:t>
+      </w:r>
+      <w:proofErr w:type="gramEnd"/>
+    </w:p>
+    <w:p>
+      <w:pPr>
+        <w:spacing w:after="100"/>
+        <w:rPr>
+          <w:sz w:val="22"/>
+          <w:szCs w:val="22"/>
+        </w:rPr>
+      </w:pPr>
+      <w:r>
+        <w:rPr>
+          <w:sz w:val="22"/>
+          <w:szCs w:val="22"/>
+        </w:rPr>
+        <w:t xml:space="preserve">- Haftalık Rapor </w:t>
+      </w:r>
+      <w:proofErr w:type="gramStart"/>
+      <w:r>
+        <w:rPr>
+          <w:sz w:val="22"/>
+          <w:szCs w:val="22"/>
+        </w:rPr>
+        <w:t>hazırlandı .</w:t>
+      </w:r>
+      <w:proofErr w:type="gramEnd"/>
+    </w:p>
+    <w:p>
+      <w:pPr>
+        <w:spacing w:after="100"/>
+        <w:rPr>
+          <w:sz w:val="22"/>
+          <w:szCs w:val="22"/>
+        </w:rPr>
+      </w:pPr>
     </w:p>
     <w:p>
       <w:pPr>
@@ -809,13 +1478,24 @@
     </w:p>
     <w:p>
       <w:pPr>
+        <w:pStyle w:val="Balk1"/>
+        <w:spacing w:before="300" w:after="150"/>
+        <w:rPr>
+          <w:b/>
+          <w:bCs/>
+          <w:color w:val="000000" w:themeColor="text1"/>
+        </w:rPr>
+      </w:pPr>
+    </w:p>
+    <w:p>
+      <w:pPr>
         <w:pStyle w:val="Balk2"/>
         <w:spacing w:before="200" w:after="100"/>
         <w:rPr>
           <w:color w:val="000000" w:themeColor="text1"/>
         </w:rPr>
       </w:pPr>
-      <w:hyperlink r:id="rId5" w:history="1">
+      <w:hyperlink r:id="rId6" w:history="1">
         <w:r>
           <w:rPr>
             <w:rStyle w:val="Kpr"/>
@@ -913,11 +1593,15 @@
         <w:spacing w:after="100"/>
         <w:rPr>
           <w:color w:val="000000" w:themeColor="text1"/>
+          <w:sz w:val="22"/>
+          <w:szCs w:val="22"/>
         </w:rPr>
       </w:pPr>
       <w:r>
         <w:rPr>
           <w:color w:val="000000" w:themeColor="text1"/>
+          <w:sz w:val="22"/>
+          <w:szCs w:val="22"/>
         </w:rPr>
         <w:t xml:space="preserve">Bu problemde iki bağlı listenin bir noktada kesişip kesişmediğini, kesişiyorsa hangi </w:t>
       </w:r>
@@ -925,6 +1609,8 @@
       <w:r>
         <w:rPr>
           <w:color w:val="000000" w:themeColor="text1"/>
+          <w:sz w:val="22"/>
+          <w:szCs w:val="22"/>
         </w:rPr>
         <w:t>node'da</w:t>
       </w:r>
@@ -932,12 +1618,16 @@
       <w:r>
         <w:rPr>
           <w:color w:val="000000" w:themeColor="text1"/>
+          <w:sz w:val="22"/>
+          <w:szCs w:val="22"/>
         </w:rPr>
         <w:t xml:space="preserve"> kesiştiğini bulmam isteniyordu. İki listenin uzunlukları farklı olabildiği için basitçe aynı anda ilerletmek işe yaramıyordu. İki işaretçi kullanarak, her işaretçi kendi listesinin sonuna ulaştığında diğer listenin başına yönlendirdim. Böylece iki işaretçi de toplamda aynı mesafeyi (iki liste uzunluğunun toplamı) farklı sırayla kat etmiş oluyor ve bir kesişim varsa tam o noktada eşitleniyorlar</w:t>
       </w:r>
       <w:r>
         <w:rPr>
           <w:color w:val="000000" w:themeColor="text1"/>
+          <w:sz w:val="22"/>
+          <w:szCs w:val="22"/>
         </w:rPr>
         <w:t xml:space="preserve"> ve döngü </w:t>
       </w:r>
@@ -946,18 +1636,24 @@
       <w:r>
         <w:rPr>
           <w:color w:val="000000" w:themeColor="text1"/>
+          <w:sz w:val="22"/>
+          <w:szCs w:val="22"/>
         </w:rPr>
         <w:t>dduruyor</w:t>
       </w:r>
       <w:r>
         <w:rPr>
           <w:color w:val="000000" w:themeColor="text1"/>
+          <w:sz w:val="22"/>
+          <w:szCs w:val="22"/>
         </w:rPr>
         <w:t>.</w:t>
       </w:r>
       <w:r>
         <w:rPr>
           <w:color w:val="000000" w:themeColor="text1"/>
+          <w:sz w:val="22"/>
+          <w:szCs w:val="22"/>
         </w:rPr>
         <w:t>Böylece</w:t>
       </w:r>
@@ -966,6 +1662,8 @@
       <w:r>
         <w:rPr>
           <w:color w:val="000000" w:themeColor="text1"/>
+          <w:sz w:val="22"/>
+          <w:szCs w:val="22"/>
         </w:rPr>
         <w:t xml:space="preserve"> kesişim noktası bulunmuş oluyor.</w:t>
       </w:r>
@@ -975,11 +1673,15 @@
         <w:spacing w:after="100"/>
         <w:rPr>
           <w:color w:val="000000" w:themeColor="text1"/>
+          <w:sz w:val="22"/>
+          <w:szCs w:val="22"/>
         </w:rPr>
       </w:pPr>
       <w:r>
         <w:rPr>
           <w:color w:val="000000" w:themeColor="text1"/>
+          <w:sz w:val="22"/>
+          <w:szCs w:val="22"/>
         </w:rPr>
         <w:t>Zaman karmaşıklığı O(</w:t>
       </w:r>
@@ -987,6 +1689,8 @@
       <w:r>
         <w:rPr>
           <w:color w:val="000000" w:themeColor="text1"/>
+          <w:sz w:val="22"/>
+          <w:szCs w:val="22"/>
         </w:rPr>
         <w:t>m+n</w:t>
       </w:r>
@@ -994,6 +1698,8 @@
       <w:r>
         <w:rPr>
           <w:color w:val="000000" w:themeColor="text1"/>
+          <w:sz w:val="22"/>
+          <w:szCs w:val="22"/>
         </w:rPr>
         <w:t xml:space="preserve">) oldu, m ve n iki listenin uzunlukları. Alan karmaşıklığı </w:t>
       </w:r>
@@ -1001,6 +1707,8 @@
       <w:r>
         <w:rPr>
           <w:color w:val="000000" w:themeColor="text1"/>
+          <w:sz w:val="22"/>
+          <w:szCs w:val="22"/>
         </w:rPr>
         <w:t>O(</w:t>
       </w:r>
@@ -1008,6 +1716,8 @@
       <w:r>
         <w:rPr>
           <w:color w:val="000000" w:themeColor="text1"/>
+          <w:sz w:val="22"/>
+          <w:szCs w:val="22"/>
         </w:rPr>
         <w:t>1) kaldı çünkü sadece iki işaretçi değişkeni kullandım, ekstra bir veri yapısı kullanmadım.</w:t>
       </w:r>
@@ -1024,7 +1734,8 @@
       <w:pPr>
         <w:spacing w:after="100"/>
         <w:rPr>
-          <w:color w:val="000000" w:themeColor="text1"/>
+          <w:sz w:val="28"/>
+          <w:szCs w:val="28"/>
         </w:rPr>
       </w:pPr>
     </w:p>
@@ -1032,6 +1743,15 @@
       <w:pPr>
         <w:spacing w:after="100"/>
         <w:rPr>
+          <w:sz w:val="28"/>
+          <w:szCs w:val="28"/>
+        </w:rPr>
+      </w:pPr>
+    </w:p>
+    <w:p>
+      <w:pPr>
+        <w:spacing w:after="100"/>
+        <w:rPr>
           <w:b/>
           <w:bCs/>
           <w:color w:val="000000" w:themeColor="text1"/>
@@ -1039,7 +1759,7 @@
           <w:szCs w:val="28"/>
         </w:rPr>
       </w:pPr>
-      <w:hyperlink r:id="rId6" w:history="1">
+      <w:hyperlink r:id="rId7" w:history="1">
         <w:r>
           <w:rPr>
             <w:rStyle w:val="Kpr"/>
@@ -1179,11 +1899,15 @@
         <w:spacing w:after="100"/>
         <w:rPr>
           <w:color w:val="000000" w:themeColor="text1"/>
+          <w:sz w:val="22"/>
+          <w:szCs w:val="22"/>
         </w:rPr>
       </w:pPr>
       <w:r>
         <w:rPr>
           <w:color w:val="000000" w:themeColor="text1"/>
+          <w:sz w:val="22"/>
+          <w:szCs w:val="22"/>
         </w:rPr>
         <w:t xml:space="preserve">Bu problemde bağlı listeden, değeri belirli bir sayıya eşit olan tüm </w:t>
       </w:r>
@@ -1191,6 +1915,8 @@
       <w:r>
         <w:rPr>
           <w:color w:val="000000" w:themeColor="text1"/>
+          <w:sz w:val="22"/>
+          <w:szCs w:val="22"/>
         </w:rPr>
         <w:t>node'ları</w:t>
       </w:r>
@@ -1198,6 +1924,8 @@
       <w:r>
         <w:rPr>
           <w:color w:val="000000" w:themeColor="text1"/>
+          <w:sz w:val="22"/>
+          <w:szCs w:val="22"/>
         </w:rPr>
         <w:t xml:space="preserve"> silmem isteniyordu. En zor kısmı, silinmesi gereken </w:t>
       </w:r>
@@ -1205,6 +1933,8 @@
       <w:r>
         <w:rPr>
           <w:color w:val="000000" w:themeColor="text1"/>
+          <w:sz w:val="22"/>
+          <w:szCs w:val="22"/>
         </w:rPr>
         <w:t>node'un</w:t>
       </w:r>
@@ -1212,6 +1942,8 @@
       <w:r>
         <w:rPr>
           <w:color w:val="000000" w:themeColor="text1"/>
+          <w:sz w:val="22"/>
+          <w:szCs w:val="22"/>
         </w:rPr>
         <w:t xml:space="preserve"> listenin en başında (</w:t>
       </w:r>
@@ -1219,6 +1951,8 @@
       <w:r>
         <w:rPr>
           <w:color w:val="000000" w:themeColor="text1"/>
+          <w:sz w:val="22"/>
+          <w:szCs w:val="22"/>
         </w:rPr>
         <w:t>head</w:t>
       </w:r>
@@ -1226,6 +1960,8 @@
       <w:r>
         <w:rPr>
           <w:color w:val="000000" w:themeColor="text1"/>
+          <w:sz w:val="22"/>
+          <w:szCs w:val="22"/>
         </w:rPr>
         <w:t xml:space="preserve">) olabilmesiydi, çünkü </w:t>
       </w:r>
@@ -1233,6 +1969,8 @@
       <w:r>
         <w:rPr>
           <w:color w:val="000000" w:themeColor="text1"/>
+          <w:sz w:val="22"/>
+          <w:szCs w:val="22"/>
         </w:rPr>
         <w:t>head'i</w:t>
       </w:r>
@@ -1240,6 +1978,8 @@
       <w:r>
         <w:rPr>
           <w:color w:val="000000" w:themeColor="text1"/>
+          <w:sz w:val="22"/>
+          <w:szCs w:val="22"/>
         </w:rPr>
         <w:t xml:space="preserve"> silmek normal bir </w:t>
       </w:r>
@@ -1247,6 +1987,8 @@
       <w:r>
         <w:rPr>
           <w:color w:val="000000" w:themeColor="text1"/>
+          <w:sz w:val="22"/>
+          <w:szCs w:val="22"/>
         </w:rPr>
         <w:t>node'u</w:t>
       </w:r>
@@ -1254,6 +1996,8 @@
       <w:r>
         <w:rPr>
           <w:color w:val="000000" w:themeColor="text1"/>
+          <w:sz w:val="22"/>
+          <w:szCs w:val="22"/>
         </w:rPr>
         <w:t xml:space="preserve"> silmekten farklı davranıyor.</w:t>
       </w:r>
@@ -1263,24 +2007,24 @@
         <w:spacing w:after="100"/>
         <w:rPr>
           <w:color w:val="000000" w:themeColor="text1"/>
+          <w:sz w:val="22"/>
+          <w:szCs w:val="22"/>
         </w:rPr>
       </w:pPr>
       <w:r>
         <w:rPr>
           <w:color w:val="000000" w:themeColor="text1"/>
-        </w:rPr>
-        <w:t xml:space="preserve">Bunu çözmek için </w:t>
-      </w:r>
-      <w:r>
-        <w:rPr>
-          <w:color w:val="000000" w:themeColor="text1"/>
-        </w:rPr>
-        <w:t xml:space="preserve">geçici bir </w:t>
-      </w:r>
-      <w:proofErr w:type="spellStart"/>
-      <w:r>
-        <w:rPr>
-          <w:color w:val="000000" w:themeColor="text1"/>
+          <w:sz w:val="22"/>
+          <w:szCs w:val="22"/>
+        </w:rPr>
+        <w:t xml:space="preserve">Bunu çözmek için geçici bir </w:t>
+      </w:r>
+      <w:proofErr w:type="spellStart"/>
+      <w:r>
+        <w:rPr>
+          <w:color w:val="000000" w:themeColor="text1"/>
+          <w:sz w:val="22"/>
+          <w:szCs w:val="22"/>
         </w:rPr>
         <w:t>node</w:t>
       </w:r>
@@ -1288,33 +2032,35 @@
       <w:r>
         <w:rPr>
           <w:color w:val="000000" w:themeColor="text1"/>
+          <w:sz w:val="22"/>
+          <w:szCs w:val="22"/>
+        </w:rPr>
+        <w:t xml:space="preserve"> kullandım. Gerçek listenin önüne değeri önemsiz bir </w:t>
+      </w:r>
+      <w:proofErr w:type="spellStart"/>
+      <w:r>
+        <w:rPr>
+          <w:color w:val="000000" w:themeColor="text1"/>
+          <w:sz w:val="22"/>
+          <w:szCs w:val="22"/>
+        </w:rPr>
+        <w:t>temp</w:t>
+      </w:r>
+      <w:proofErr w:type="spellEnd"/>
+      <w:r>
+        <w:rPr>
+          <w:color w:val="000000" w:themeColor="text1"/>
+          <w:sz w:val="22"/>
+          <w:szCs w:val="22"/>
         </w:rPr>
         <w:t xml:space="preserve"> </w:t>
       </w:r>
-      <w:r>
-        <w:rPr>
-          <w:color w:val="000000" w:themeColor="text1"/>
-        </w:rPr>
-        <w:t xml:space="preserve">kullandım. Gerçek listenin önüne değeri önemsiz bir </w:t>
-      </w:r>
-      <w:proofErr w:type="spellStart"/>
-      <w:r>
-        <w:rPr>
-          <w:color w:val="000000" w:themeColor="text1"/>
-        </w:rPr>
-        <w:t>temp</w:t>
-      </w:r>
-      <w:proofErr w:type="spellEnd"/>
-      <w:r>
-        <w:rPr>
-          <w:color w:val="000000" w:themeColor="text1"/>
-        </w:rPr>
-        <w:t xml:space="preserve"> </w:t>
-      </w:r>
-      <w:proofErr w:type="spellStart"/>
-      <w:r>
-        <w:rPr>
-          <w:color w:val="000000" w:themeColor="text1"/>
+      <w:proofErr w:type="spellStart"/>
+      <w:r>
+        <w:rPr>
+          <w:color w:val="000000" w:themeColor="text1"/>
+          <w:sz w:val="22"/>
+          <w:szCs w:val="22"/>
         </w:rPr>
         <w:t>node</w:t>
       </w:r>
@@ -1322,6 +2068,8 @@
       <w:r>
         <w:rPr>
           <w:color w:val="000000" w:themeColor="text1"/>
+          <w:sz w:val="22"/>
+          <w:szCs w:val="22"/>
         </w:rPr>
         <w:t xml:space="preserve"> ekleyip onu </w:t>
       </w:r>
@@ -1329,6 +2077,8 @@
       <w:r>
         <w:rPr>
           <w:color w:val="000000" w:themeColor="text1"/>
+          <w:sz w:val="22"/>
+          <w:szCs w:val="22"/>
         </w:rPr>
         <w:t>head'e</w:t>
       </w:r>
@@ -1336,6 +2086,8 @@
       <w:r>
         <w:rPr>
           <w:color w:val="000000" w:themeColor="text1"/>
+          <w:sz w:val="22"/>
+          <w:szCs w:val="22"/>
         </w:rPr>
         <w:t xml:space="preserve"> bağladım. Böylece </w:t>
       </w:r>
@@ -1343,6 +2095,8 @@
       <w:r>
         <w:rPr>
           <w:color w:val="000000" w:themeColor="text1"/>
+          <w:sz w:val="22"/>
+          <w:szCs w:val="22"/>
         </w:rPr>
         <w:t>head'in</w:t>
       </w:r>
@@ -1350,6 +2104,8 @@
       <w:r>
         <w:rPr>
           <w:color w:val="000000" w:themeColor="text1"/>
+          <w:sz w:val="22"/>
+          <w:szCs w:val="22"/>
         </w:rPr>
         <w:t xml:space="preserve"> silinmesi durumu, artık özel bir kontrol gerektirmeden diğer </w:t>
       </w:r>
@@ -1357,6 +2113,8 @@
       <w:r>
         <w:rPr>
           <w:color w:val="000000" w:themeColor="text1"/>
+          <w:sz w:val="22"/>
+          <w:szCs w:val="22"/>
         </w:rPr>
         <w:t>node'ların</w:t>
       </w:r>
@@ -1364,6 +2122,8 @@
       <w:r>
         <w:rPr>
           <w:color w:val="000000" w:themeColor="text1"/>
+          <w:sz w:val="22"/>
+          <w:szCs w:val="22"/>
         </w:rPr>
         <w:t xml:space="preserve"> silinmesiyle aynı mantığa uydu. Listeyi </w:t>
       </w:r>
@@ -1371,19 +2131,17 @@
       <w:r>
         <w:rPr>
           <w:color w:val="000000" w:themeColor="text1"/>
-        </w:rPr>
-        <w:t>temp</w:t>
-      </w:r>
-      <w:r>
-        <w:rPr>
-          <w:color w:val="000000" w:themeColor="text1"/>
-        </w:rPr>
-        <w:t>'den</w:t>
-      </w:r>
-      <w:proofErr w:type="spellEnd"/>
-      <w:r>
-        <w:rPr>
-          <w:color w:val="000000" w:themeColor="text1"/>
+          <w:sz w:val="22"/>
+          <w:szCs w:val="22"/>
+        </w:rPr>
+        <w:t>temp'den</w:t>
+      </w:r>
+      <w:proofErr w:type="spellEnd"/>
+      <w:r>
+        <w:rPr>
+          <w:color w:val="000000" w:themeColor="text1"/>
+          <w:sz w:val="22"/>
+          <w:szCs w:val="22"/>
         </w:rPr>
         <w:t xml:space="preserve"> başlayarak gezip, bir sonraki </w:t>
       </w:r>
@@ -1391,6 +2149,8 @@
       <w:r>
         <w:rPr>
           <w:color w:val="000000" w:themeColor="text1"/>
+          <w:sz w:val="22"/>
+          <w:szCs w:val="22"/>
         </w:rPr>
         <w:t>node'un</w:t>
       </w:r>
@@ -1398,6 +2158,8 @@
       <w:r>
         <w:rPr>
           <w:color w:val="000000" w:themeColor="text1"/>
+          <w:sz w:val="22"/>
+          <w:szCs w:val="22"/>
         </w:rPr>
         <w:t xml:space="preserve"> değeri aranan değere eşitse o </w:t>
       </w:r>
@@ -1405,6 +2167,8 @@
       <w:r>
         <w:rPr>
           <w:color w:val="000000" w:themeColor="text1"/>
+          <w:sz w:val="22"/>
+          <w:szCs w:val="22"/>
         </w:rPr>
         <w:t>node'u</w:t>
       </w:r>
@@ -1412,6 +2176,8 @@
       <w:r>
         <w:rPr>
           <w:color w:val="000000" w:themeColor="text1"/>
+          <w:sz w:val="22"/>
+          <w:szCs w:val="22"/>
         </w:rPr>
         <w:t xml:space="preserve"> atlayarak sildim, değilse bir ileri gittim.</w:t>
       </w:r>
@@ -1421,11 +2187,15 @@
         <w:spacing w:after="100"/>
         <w:rPr>
           <w:color w:val="000000" w:themeColor="text1"/>
+          <w:sz w:val="22"/>
+          <w:szCs w:val="22"/>
         </w:rPr>
       </w:pPr>
       <w:r>
         <w:rPr>
           <w:color w:val="000000" w:themeColor="text1"/>
+          <w:sz w:val="22"/>
+          <w:szCs w:val="22"/>
         </w:rPr>
         <w:t xml:space="preserve">Zaman karmaşıklığı O(n) oldu çünkü liste sadece bir kez baştan sona gezildi, alan karmaşıklığı da </w:t>
       </w:r>
@@ -1433,6 +2203,8 @@
       <w:r>
         <w:rPr>
           <w:color w:val="000000" w:themeColor="text1"/>
+          <w:sz w:val="22"/>
+          <w:szCs w:val="22"/>
         </w:rPr>
         <w:t>O(</w:t>
       </w:r>
@@ -1440,29 +2212,439 @@
       <w:r>
         <w:rPr>
           <w:color w:val="000000" w:themeColor="text1"/>
-        </w:rPr>
-        <w:t>1) kaldı çünkü yeni bir liste oluşturmadım, sadece iki referans</w:t>
-      </w:r>
-      <w:r>
-        <w:rPr>
-          <w:color w:val="000000" w:themeColor="text1"/>
-        </w:rPr>
-        <w:t xml:space="preserve"> </w:t>
-      </w:r>
-      <w:r>
-        <w:rPr>
-          <w:color w:val="000000" w:themeColor="text1"/>
-        </w:rPr>
-        <w:t>kullandım.</w:t>
+          <w:sz w:val="22"/>
+          <w:szCs w:val="22"/>
+        </w:rPr>
+        <w:t>1) kaldı çünkü yeni bir liste oluşturmadım, sadece iki referans kullandım</w:t>
       </w:r>
     </w:p>
     <w:p>
       <w:pPr>
         <w:spacing w:after="100"/>
         <w:rPr>
-          <w:color w:val="000000" w:themeColor="text1"/>
+          <w:b/>
+          <w:bCs/>
+          <w:color w:val="000000" w:themeColor="text1"/>
+          <w:sz w:val="28"/>
+          <w:szCs w:val="28"/>
         </w:rPr>
       </w:pPr>
+    </w:p>
+    <w:p>
+      <w:pPr>
+        <w:spacing w:after="100"/>
+        <w:rPr>
+          <w:b/>
+          <w:bCs/>
+          <w:color w:val="000000" w:themeColor="text1"/>
+          <w:sz w:val="28"/>
+          <w:szCs w:val="28"/>
+        </w:rPr>
+      </w:pPr>
+      <w:hyperlink r:id="rId8" w:history="1">
+        <w:r>
+          <w:rPr>
+            <w:rStyle w:val="Kpr"/>
+            <w:b/>
+            <w:bCs/>
+            <w:sz w:val="28"/>
+            <w:szCs w:val="28"/>
+          </w:rPr>
+          <w:t xml:space="preserve">3) </w:t>
+        </w:r>
+        <w:proofErr w:type="spellStart"/>
+        <w:r>
+          <w:rPr>
+            <w:rStyle w:val="Kpr"/>
+            <w:b/>
+            <w:bCs/>
+            <w:sz w:val="28"/>
+            <w:szCs w:val="28"/>
+          </w:rPr>
+          <w:t>LeetCode</w:t>
+        </w:r>
+        <w:proofErr w:type="spellEnd"/>
+        <w:r>
+          <w:rPr>
+            <w:rStyle w:val="Kpr"/>
+            <w:b/>
+            <w:bCs/>
+            <w:sz w:val="28"/>
+            <w:szCs w:val="28"/>
+          </w:rPr>
+          <w:t xml:space="preserve"> </w:t>
+        </w:r>
+        <w:proofErr w:type="gramStart"/>
+        <w:r>
+          <w:rPr>
+            <w:rStyle w:val="Kpr"/>
+            <w:b/>
+            <w:bCs/>
+            <w:sz w:val="28"/>
+            <w:szCs w:val="28"/>
+          </w:rPr>
+          <w:t>700 -</w:t>
+        </w:r>
+        <w:proofErr w:type="gramEnd"/>
+        <w:r>
+          <w:rPr>
+            <w:rStyle w:val="Kpr"/>
+            <w:b/>
+            <w:bCs/>
+            <w:sz w:val="28"/>
+            <w:szCs w:val="28"/>
+          </w:rPr>
+          <w:t xml:space="preserve"> </w:t>
+        </w:r>
+        <w:proofErr w:type="spellStart"/>
+        <w:r>
+          <w:rPr>
+            <w:rStyle w:val="Kpr"/>
+            <w:b/>
+            <w:bCs/>
+            <w:sz w:val="28"/>
+            <w:szCs w:val="28"/>
+          </w:rPr>
+          <w:t>Search</w:t>
+        </w:r>
+        <w:proofErr w:type="spellEnd"/>
+        <w:r>
+          <w:rPr>
+            <w:rStyle w:val="Kpr"/>
+            <w:b/>
+            <w:bCs/>
+            <w:sz w:val="28"/>
+            <w:szCs w:val="28"/>
+          </w:rPr>
+          <w:t xml:space="preserve"> in a </w:t>
+        </w:r>
+        <w:proofErr w:type="spellStart"/>
+        <w:r>
+          <w:rPr>
+            <w:rStyle w:val="Kpr"/>
+            <w:b/>
+            <w:bCs/>
+            <w:sz w:val="28"/>
+            <w:szCs w:val="28"/>
+          </w:rPr>
+          <w:t>Binary</w:t>
+        </w:r>
+        <w:proofErr w:type="spellEnd"/>
+        <w:r>
+          <w:rPr>
+            <w:rStyle w:val="Kpr"/>
+            <w:b/>
+            <w:bCs/>
+            <w:sz w:val="28"/>
+            <w:szCs w:val="28"/>
+          </w:rPr>
+          <w:t xml:space="preserve"> </w:t>
+        </w:r>
+        <w:proofErr w:type="spellStart"/>
+        <w:r>
+          <w:rPr>
+            <w:rStyle w:val="Kpr"/>
+            <w:b/>
+            <w:bCs/>
+            <w:sz w:val="28"/>
+            <w:szCs w:val="28"/>
+          </w:rPr>
+          <w:t>Search</w:t>
+        </w:r>
+        <w:proofErr w:type="spellEnd"/>
+        <w:r>
+          <w:rPr>
+            <w:rStyle w:val="Kpr"/>
+            <w:b/>
+            <w:bCs/>
+            <w:sz w:val="28"/>
+            <w:szCs w:val="28"/>
+          </w:rPr>
+          <w:t xml:space="preserve"> </w:t>
+        </w:r>
+        <w:proofErr w:type="spellStart"/>
+        <w:r>
+          <w:rPr>
+            <w:rStyle w:val="Kpr"/>
+            <w:b/>
+            <w:bCs/>
+            <w:sz w:val="28"/>
+            <w:szCs w:val="28"/>
+          </w:rPr>
+          <w:t>Tree</w:t>
+        </w:r>
+        <w:proofErr w:type="spellEnd"/>
+      </w:hyperlink>
+    </w:p>
+    <w:p>
+      <w:pPr>
+        <w:spacing w:after="100"/>
+        <w:rPr>
+          <w:color w:val="000000" w:themeColor="text1"/>
+          <w:sz w:val="22"/>
+          <w:szCs w:val="22"/>
+        </w:rPr>
+      </w:pPr>
+      <w:r>
+        <w:rPr>
+          <w:color w:val="000000" w:themeColor="text1"/>
+          <w:sz w:val="22"/>
+          <w:szCs w:val="22"/>
+        </w:rPr>
+        <w:t xml:space="preserve">Bu problemde </w:t>
+      </w:r>
+      <w:proofErr w:type="spellStart"/>
+      <w:r>
+        <w:rPr>
+          <w:color w:val="000000" w:themeColor="text1"/>
+          <w:sz w:val="22"/>
+          <w:szCs w:val="22"/>
+        </w:rPr>
+        <w:t>BST'de</w:t>
+      </w:r>
+      <w:proofErr w:type="spellEnd"/>
+      <w:r>
+        <w:rPr>
+          <w:color w:val="000000" w:themeColor="text1"/>
+          <w:sz w:val="22"/>
+          <w:szCs w:val="22"/>
+        </w:rPr>
+        <w:t xml:space="preserve"> değeri aranan sayıya eşit olan </w:t>
+      </w:r>
+      <w:proofErr w:type="spellStart"/>
+      <w:r>
+        <w:rPr>
+          <w:color w:val="000000" w:themeColor="text1"/>
+          <w:sz w:val="22"/>
+          <w:szCs w:val="22"/>
+        </w:rPr>
+        <w:t>node'u</w:t>
+      </w:r>
+      <w:proofErr w:type="spellEnd"/>
+      <w:r>
+        <w:rPr>
+          <w:color w:val="000000" w:themeColor="text1"/>
+          <w:sz w:val="22"/>
+          <w:szCs w:val="22"/>
+        </w:rPr>
+        <w:t xml:space="preserve"> bulup, o </w:t>
+      </w:r>
+      <w:proofErr w:type="spellStart"/>
+      <w:r>
+        <w:rPr>
+          <w:color w:val="000000" w:themeColor="text1"/>
+          <w:sz w:val="22"/>
+          <w:szCs w:val="22"/>
+        </w:rPr>
+        <w:t>node'u</w:t>
+      </w:r>
+      <w:proofErr w:type="spellEnd"/>
+      <w:r>
+        <w:rPr>
+          <w:color w:val="000000" w:themeColor="text1"/>
+          <w:sz w:val="22"/>
+          <w:szCs w:val="22"/>
+        </w:rPr>
+        <w:t xml:space="preserve"> kök kabul eden alt ağacı döndürmem isteniyordu. </w:t>
+      </w:r>
+      <w:proofErr w:type="spellStart"/>
+      <w:r>
+        <w:rPr>
+          <w:color w:val="000000" w:themeColor="text1"/>
+          <w:sz w:val="22"/>
+          <w:szCs w:val="22"/>
+        </w:rPr>
+        <w:t>BST'nin</w:t>
+      </w:r>
+      <w:proofErr w:type="spellEnd"/>
+      <w:r>
+        <w:rPr>
+          <w:color w:val="000000" w:themeColor="text1"/>
+          <w:sz w:val="22"/>
+          <w:szCs w:val="22"/>
+        </w:rPr>
+        <w:t xml:space="preserve"> kuralını (bir </w:t>
+      </w:r>
+      <w:proofErr w:type="spellStart"/>
+      <w:r>
+        <w:rPr>
+          <w:color w:val="000000" w:themeColor="text1"/>
+          <w:sz w:val="22"/>
+          <w:szCs w:val="22"/>
+        </w:rPr>
+        <w:t>node'un</w:t>
+      </w:r>
+      <w:proofErr w:type="spellEnd"/>
+      <w:r>
+        <w:rPr>
+          <w:color w:val="000000" w:themeColor="text1"/>
+          <w:sz w:val="22"/>
+          <w:szCs w:val="22"/>
+        </w:rPr>
+        <w:t xml:space="preserve"> solundaki her şey ondan küçük, sağındaki her şey ondan büyük) kullanarak, </w:t>
+      </w:r>
+      <w:proofErr w:type="spellStart"/>
+      <w:r>
+        <w:rPr>
+          <w:color w:val="000000" w:themeColor="text1"/>
+          <w:sz w:val="22"/>
+          <w:szCs w:val="22"/>
+        </w:rPr>
+        <w:t>root'tan</w:t>
+      </w:r>
+      <w:proofErr w:type="spellEnd"/>
+      <w:r>
+        <w:rPr>
+          <w:color w:val="000000" w:themeColor="text1"/>
+          <w:sz w:val="22"/>
+          <w:szCs w:val="22"/>
+        </w:rPr>
+        <w:t xml:space="preserve"> başlayıp aranan değer küçükse sola, büyükse sağa giderek ilerledim. Bunun </w:t>
+      </w:r>
+      <w:proofErr w:type="spellStart"/>
+      <w:r>
+        <w:rPr>
+          <w:color w:val="000000" w:themeColor="text1"/>
+          <w:sz w:val="22"/>
+          <w:szCs w:val="22"/>
+        </w:rPr>
+        <w:t>Binary</w:t>
+      </w:r>
+      <w:proofErr w:type="spellEnd"/>
+      <w:r>
+        <w:rPr>
+          <w:color w:val="000000" w:themeColor="text1"/>
+          <w:sz w:val="22"/>
+          <w:szCs w:val="22"/>
+        </w:rPr>
+        <w:t xml:space="preserve"> </w:t>
+      </w:r>
+      <w:proofErr w:type="spellStart"/>
+      <w:r>
+        <w:rPr>
+          <w:color w:val="000000" w:themeColor="text1"/>
+          <w:sz w:val="22"/>
+          <w:szCs w:val="22"/>
+        </w:rPr>
+        <w:t>Search'teki</w:t>
+      </w:r>
+      <w:proofErr w:type="spellEnd"/>
+      <w:r>
+        <w:rPr>
+          <w:color w:val="000000" w:themeColor="text1"/>
+          <w:sz w:val="22"/>
+          <w:szCs w:val="22"/>
+        </w:rPr>
+        <w:t xml:space="preserve"> mantığın ağaç versiyonu gibi olduğunu fark ettim.</w:t>
+      </w:r>
+    </w:p>
+    <w:p>
+      <w:pPr>
+        <w:spacing w:after="100"/>
+        <w:rPr>
+          <w:color w:val="000000" w:themeColor="text1"/>
+          <w:sz w:val="22"/>
+          <w:szCs w:val="22"/>
+        </w:rPr>
+      </w:pPr>
+      <w:r>
+        <w:rPr>
+          <w:color w:val="000000" w:themeColor="text1"/>
+          <w:sz w:val="22"/>
+          <w:szCs w:val="22"/>
+        </w:rPr>
+        <w:t xml:space="preserve">Zaman karmaşıklığı O(h) oldu, h ağacın yüksekliği. Alan karmaşıklığı </w:t>
+      </w:r>
+      <w:proofErr w:type="gramStart"/>
+      <w:r>
+        <w:rPr>
+          <w:color w:val="000000" w:themeColor="text1"/>
+          <w:sz w:val="22"/>
+          <w:szCs w:val="22"/>
+        </w:rPr>
+        <w:t>O(</w:t>
+      </w:r>
+      <w:proofErr w:type="gramEnd"/>
+      <w:r>
+        <w:rPr>
+          <w:color w:val="000000" w:themeColor="text1"/>
+          <w:sz w:val="22"/>
+          <w:szCs w:val="22"/>
+        </w:rPr>
+        <w:t xml:space="preserve">1) kaldı çünkü </w:t>
+      </w:r>
+      <w:proofErr w:type="spellStart"/>
+      <w:r>
+        <w:rPr>
+          <w:color w:val="000000" w:themeColor="text1"/>
+          <w:sz w:val="22"/>
+          <w:szCs w:val="22"/>
+        </w:rPr>
+        <w:t>recursive</w:t>
+      </w:r>
+      <w:proofErr w:type="spellEnd"/>
+      <w:r>
+        <w:rPr>
+          <w:color w:val="000000" w:themeColor="text1"/>
+          <w:sz w:val="22"/>
+          <w:szCs w:val="22"/>
+        </w:rPr>
+        <w:t xml:space="preserve"> değil, iteratif (</w:t>
+      </w:r>
+      <w:proofErr w:type="spellStart"/>
+      <w:r>
+        <w:rPr>
+          <w:color w:val="000000" w:themeColor="text1"/>
+          <w:sz w:val="22"/>
+          <w:szCs w:val="22"/>
+        </w:rPr>
+        <w:t>while</w:t>
+      </w:r>
+      <w:proofErr w:type="spellEnd"/>
+      <w:r>
+        <w:rPr>
+          <w:color w:val="000000" w:themeColor="text1"/>
+          <w:sz w:val="22"/>
+          <w:szCs w:val="22"/>
+        </w:rPr>
+        <w:t xml:space="preserve"> ile) bir çözüm yazdım, ekstra bir </w:t>
+      </w:r>
+      <w:proofErr w:type="spellStart"/>
+      <w:r>
+        <w:rPr>
+          <w:color w:val="000000" w:themeColor="text1"/>
+          <w:sz w:val="22"/>
+          <w:szCs w:val="22"/>
+        </w:rPr>
+        <w:t>call</w:t>
+      </w:r>
+      <w:proofErr w:type="spellEnd"/>
+      <w:r>
+        <w:rPr>
+          <w:color w:val="000000" w:themeColor="text1"/>
+          <w:sz w:val="22"/>
+          <w:szCs w:val="22"/>
+        </w:rPr>
+        <w:t xml:space="preserve"> </w:t>
+      </w:r>
+      <w:proofErr w:type="spellStart"/>
+      <w:r>
+        <w:rPr>
+          <w:color w:val="000000" w:themeColor="text1"/>
+          <w:sz w:val="22"/>
+          <w:szCs w:val="22"/>
+        </w:rPr>
+        <w:t>stack</w:t>
+      </w:r>
+      <w:proofErr w:type="spellEnd"/>
+      <w:r>
+        <w:rPr>
+          <w:color w:val="000000" w:themeColor="text1"/>
+          <w:sz w:val="22"/>
+          <w:szCs w:val="22"/>
+        </w:rPr>
+        <w:t xml:space="preserve"> birikmedi.</w:t>
+      </w:r>
     </w:p>
     <w:p>
       <w:pPr>
@@ -1472,12 +2654,14 @@
           <w:color w:val="000000" w:themeColor="text1"/>
         </w:rPr>
       </w:pPr>
-      <w:r>
-        <w:rPr>
-          <w:color w:val="000000" w:themeColor="text1"/>
-        </w:rPr>
-        <w:t>3. Teknik Kaynak Özeti</w:t>
-      </w:r>
+      <w:hyperlink r:id="rId9" w:history="1">
+        <w:r>
+          <w:rPr>
+            <w:rStyle w:val="Kpr"/>
+          </w:rPr>
+          <w:t>3. Teknik Kaynak Özeti</w:t>
+        </w:r>
+      </w:hyperlink>
     </w:p>
     <w:p>
       <w:pPr>
@@ -1485,8 +2669,200 @@
         <w:spacing w:before="300" w:after="150"/>
         <w:rPr>
           <w:color w:val="000000" w:themeColor="text1"/>
+          <w:sz w:val="22"/>
+          <w:szCs w:val="22"/>
         </w:rPr>
       </w:pPr>
+      <w:r>
+        <w:rPr>
+          <w:color w:val="000000" w:themeColor="text1"/>
+        </w:rPr>
+        <w:t xml:space="preserve">   </w:t>
+      </w:r>
+      <w:r>
+        <w:rPr>
+          <w:color w:val="000000" w:themeColor="text1"/>
+          <w:sz w:val="22"/>
+          <w:szCs w:val="22"/>
+        </w:rPr>
+        <w:t xml:space="preserve">Bu makalede ilk olarak </w:t>
+      </w:r>
+      <w:proofErr w:type="spellStart"/>
+      <w:r>
+        <w:rPr>
+          <w:color w:val="000000" w:themeColor="text1"/>
+          <w:sz w:val="22"/>
+          <w:szCs w:val="22"/>
+        </w:rPr>
+        <w:t>graph</w:t>
+      </w:r>
+      <w:proofErr w:type="spellEnd"/>
+      <w:r>
+        <w:rPr>
+          <w:color w:val="000000" w:themeColor="text1"/>
+          <w:sz w:val="22"/>
+          <w:szCs w:val="22"/>
+        </w:rPr>
+        <w:t xml:space="preserve"> yapılarının</w:t>
+      </w:r>
+      <w:r>
+        <w:rPr>
+          <w:color w:val="auto"/>
+          <w:sz w:val="22"/>
+          <w:szCs w:val="22"/>
+        </w:rPr>
+        <w:t xml:space="preserve"> </w:t>
+      </w:r>
+      <w:r>
+        <w:rPr>
+          <w:color w:val="000000" w:themeColor="text1"/>
+          <w:sz w:val="22"/>
+          <w:szCs w:val="22"/>
+        </w:rPr>
+        <w:t xml:space="preserve">nesneler arasındaki ilişkileri ve ağları göstermek için kullanılabileceği anlatılmıştır. </w:t>
+      </w:r>
+      <w:proofErr w:type="spellStart"/>
+      <w:r>
+        <w:rPr>
+          <w:color w:val="000000" w:themeColor="text1"/>
+          <w:sz w:val="22"/>
+          <w:szCs w:val="22"/>
+        </w:rPr>
+        <w:t>Graphların</w:t>
+      </w:r>
+      <w:proofErr w:type="spellEnd"/>
+      <w:r>
+        <w:rPr>
+          <w:color w:val="000000" w:themeColor="text1"/>
+          <w:sz w:val="22"/>
+          <w:szCs w:val="22"/>
+        </w:rPr>
+        <w:t xml:space="preserve"> kullanılmasında yaygın olarak </w:t>
+      </w:r>
+      <w:proofErr w:type="spellStart"/>
+      <w:r>
+        <w:rPr>
+          <w:color w:val="000000" w:themeColor="text1"/>
+          <w:sz w:val="22"/>
+          <w:szCs w:val="22"/>
+        </w:rPr>
+        <w:t>adjacency</w:t>
+      </w:r>
+      <w:proofErr w:type="spellEnd"/>
+      <w:r>
+        <w:rPr>
+          <w:color w:val="000000" w:themeColor="text1"/>
+          <w:sz w:val="22"/>
+          <w:szCs w:val="22"/>
+        </w:rPr>
+        <w:t xml:space="preserve"> </w:t>
+      </w:r>
+      <w:proofErr w:type="spellStart"/>
+      <w:r>
+        <w:rPr>
+          <w:color w:val="000000" w:themeColor="text1"/>
+          <w:sz w:val="22"/>
+          <w:szCs w:val="22"/>
+        </w:rPr>
+        <w:t>list</w:t>
+      </w:r>
+      <w:proofErr w:type="spellEnd"/>
+      <w:r>
+        <w:rPr>
+          <w:color w:val="000000" w:themeColor="text1"/>
+          <w:sz w:val="22"/>
+          <w:szCs w:val="22"/>
+        </w:rPr>
+        <w:t xml:space="preserve"> (komşuluk listesi) kullanılır ve bu yapıda her düğümün bağlı olduğu diğer düğümler bir liste içerisinde tutulur.</w:t>
+      </w:r>
+      <w:r>
+        <w:rPr>
+          <w:color w:val="auto"/>
+          <w:sz w:val="22"/>
+          <w:szCs w:val="22"/>
+        </w:rPr>
+        <w:t xml:space="preserve"> </w:t>
+      </w:r>
+      <w:r>
+        <w:rPr>
+          <w:color w:val="000000" w:themeColor="text1"/>
+          <w:sz w:val="22"/>
+          <w:szCs w:val="22"/>
+        </w:rPr>
+        <w:t xml:space="preserve">Daha sonra </w:t>
+      </w:r>
+      <w:proofErr w:type="spellStart"/>
+      <w:r>
+        <w:rPr>
+          <w:color w:val="000000" w:themeColor="text1"/>
+          <w:sz w:val="22"/>
+          <w:szCs w:val="22"/>
+        </w:rPr>
+        <w:t>linked</w:t>
+      </w:r>
+      <w:proofErr w:type="spellEnd"/>
+      <w:r>
+        <w:rPr>
+          <w:color w:val="000000" w:themeColor="text1"/>
+          <w:sz w:val="22"/>
+          <w:szCs w:val="22"/>
+        </w:rPr>
+        <w:t xml:space="preserve"> </w:t>
+      </w:r>
+      <w:proofErr w:type="spellStart"/>
+      <w:r>
+        <w:rPr>
+          <w:color w:val="000000" w:themeColor="text1"/>
+          <w:sz w:val="22"/>
+          <w:szCs w:val="22"/>
+        </w:rPr>
+        <w:t>listlerin</w:t>
+      </w:r>
+      <w:proofErr w:type="spellEnd"/>
+      <w:r>
+        <w:rPr>
+          <w:color w:val="000000" w:themeColor="text1"/>
+          <w:sz w:val="22"/>
+          <w:szCs w:val="22"/>
+        </w:rPr>
+        <w:t xml:space="preserve"> normal Python listelerinden farkları ve hangi işlemlerde daha avantajlı oldukları açıklanmıştır. Özellikle </w:t>
+      </w:r>
+      <w:proofErr w:type="spellStart"/>
+      <w:r>
+        <w:rPr>
+          <w:color w:val="000000" w:themeColor="text1"/>
+          <w:sz w:val="22"/>
+          <w:szCs w:val="22"/>
+        </w:rPr>
+        <w:t>linked</w:t>
+      </w:r>
+      <w:proofErr w:type="spellEnd"/>
+      <w:r>
+        <w:rPr>
+          <w:color w:val="000000" w:themeColor="text1"/>
+          <w:sz w:val="22"/>
+          <w:szCs w:val="22"/>
+        </w:rPr>
+        <w:t xml:space="preserve"> </w:t>
+      </w:r>
+      <w:proofErr w:type="spellStart"/>
+      <w:r>
+        <w:rPr>
+          <w:color w:val="000000" w:themeColor="text1"/>
+          <w:sz w:val="22"/>
+          <w:szCs w:val="22"/>
+        </w:rPr>
+        <w:t>listlerde</w:t>
+      </w:r>
+      <w:proofErr w:type="spellEnd"/>
+      <w:r>
+        <w:rPr>
+          <w:color w:val="000000" w:themeColor="text1"/>
+          <w:sz w:val="22"/>
+          <w:szCs w:val="22"/>
+        </w:rPr>
+        <w:t xml:space="preserve"> eleman ekleme ve silme işlemleri uygun konumlarda daha hızlı yapılabilirken, belirli bir elemana erişmek normal listelere göre daha yavaş olduğu anlatılmıştır.</w:t>
+      </w:r>
     </w:p>
     <w:p>
       <w:pPr>
@@ -1494,8 +2870,92 @@
         <w:spacing w:before="300" w:after="150"/>
         <w:rPr>
           <w:color w:val="000000" w:themeColor="text1"/>
+          <w:sz w:val="22"/>
+          <w:szCs w:val="22"/>
         </w:rPr>
       </w:pPr>
+      <w:r>
+        <w:rPr>
+          <w:color w:val="000000" w:themeColor="text1"/>
+          <w:sz w:val="22"/>
+          <w:szCs w:val="22"/>
+        </w:rPr>
+        <w:t xml:space="preserve">    Python'da </w:t>
+      </w:r>
+      <w:proofErr w:type="spellStart"/>
+      <w:proofErr w:type="gramStart"/>
+      <w:r>
+        <w:rPr>
+          <w:color w:val="000000" w:themeColor="text1"/>
+          <w:sz w:val="22"/>
+          <w:szCs w:val="22"/>
+        </w:rPr>
+        <w:t>collections.deque</w:t>
+      </w:r>
+      <w:proofErr w:type="spellEnd"/>
+      <w:proofErr w:type="gramEnd"/>
+      <w:r>
+        <w:rPr>
+          <w:color w:val="000000" w:themeColor="text1"/>
+          <w:sz w:val="22"/>
+          <w:szCs w:val="22"/>
+        </w:rPr>
+        <w:t xml:space="preserve"> yapısı, listenin hem başından hem de sonundan hızlı bir şekilde eleman ekleyip çıkarmak için kullanılabilir. Bu yüzden </w:t>
+      </w:r>
+      <w:proofErr w:type="spellStart"/>
+      <w:r>
+        <w:rPr>
+          <w:color w:val="000000" w:themeColor="text1"/>
+          <w:sz w:val="22"/>
+          <w:szCs w:val="22"/>
+        </w:rPr>
+        <w:t>queue</w:t>
+      </w:r>
+      <w:proofErr w:type="spellEnd"/>
+      <w:r>
+        <w:rPr>
+          <w:color w:val="000000" w:themeColor="text1"/>
+          <w:sz w:val="22"/>
+          <w:szCs w:val="22"/>
+        </w:rPr>
+        <w:t xml:space="preserve"> ve </w:t>
+      </w:r>
+      <w:proofErr w:type="spellStart"/>
+      <w:r>
+        <w:rPr>
+          <w:color w:val="000000" w:themeColor="text1"/>
+          <w:sz w:val="22"/>
+          <w:szCs w:val="22"/>
+        </w:rPr>
+        <w:t>stack</w:t>
+      </w:r>
+      <w:proofErr w:type="spellEnd"/>
+      <w:r>
+        <w:rPr>
+          <w:color w:val="000000" w:themeColor="text1"/>
+          <w:sz w:val="22"/>
+          <w:szCs w:val="22"/>
+        </w:rPr>
+        <w:t xml:space="preserve"> gibi veri yapılarında kullanışlıdır. Queue yapısında ilk giren eleman ilk çıkar (FIFO), </w:t>
+      </w:r>
+      <w:proofErr w:type="spellStart"/>
+      <w:r>
+        <w:rPr>
+          <w:color w:val="000000" w:themeColor="text1"/>
+          <w:sz w:val="22"/>
+          <w:szCs w:val="22"/>
+        </w:rPr>
+        <w:t>Stack</w:t>
+      </w:r>
+      <w:proofErr w:type="spellEnd"/>
+      <w:r>
+        <w:rPr>
+          <w:color w:val="000000" w:themeColor="text1"/>
+          <w:sz w:val="22"/>
+          <w:szCs w:val="22"/>
+        </w:rPr>
+        <w:t xml:space="preserve"> yapısında ise son giren eleman ilk çıkar (LIFO).</w:t>
+      </w:r>
     </w:p>
     <w:p>
       <w:pPr>
@@ -1510,87 +2970,29 @@
       <w:r>
         <w:rPr>
           <w:color w:val="000000" w:themeColor="text1"/>
+          <w:sz w:val="22"/>
+          <w:szCs w:val="22"/>
         </w:rPr>
         <w:t xml:space="preserve">    </w:t>
       </w:r>
-      <w:r>
-        <w:rPr>
-          <w:color w:val="000000" w:themeColor="text1"/>
-          <w:sz w:val="22"/>
-          <w:szCs w:val="22"/>
-        </w:rPr>
-        <w:t xml:space="preserve">Bu makalede ilk olarak </w:t>
-      </w:r>
-      <w:proofErr w:type="spellStart"/>
-      <w:r>
-        <w:rPr>
-          <w:color w:val="000000" w:themeColor="text1"/>
-          <w:sz w:val="22"/>
-          <w:szCs w:val="22"/>
-        </w:rPr>
-        <w:t>graph</w:t>
-      </w:r>
-      <w:proofErr w:type="spellEnd"/>
-      <w:r>
-        <w:rPr>
-          <w:color w:val="000000" w:themeColor="text1"/>
-          <w:sz w:val="22"/>
-          <w:szCs w:val="22"/>
-        </w:rPr>
-        <w:t xml:space="preserve"> yapılarının</w:t>
-      </w:r>
-      <w:r>
-        <w:rPr>
-          <w:color w:val="auto"/>
+      <w:proofErr w:type="spellStart"/>
+      <w:r>
+        <w:rPr>
+          <w:color w:val="000000" w:themeColor="text1"/>
+          <w:sz w:val="22"/>
+          <w:szCs w:val="22"/>
+        </w:rPr>
+        <w:t>Linked</w:t>
+      </w:r>
+      <w:proofErr w:type="spellEnd"/>
+      <w:r>
+        <w:rPr>
+          <w:color w:val="000000" w:themeColor="text1"/>
           <w:sz w:val="22"/>
           <w:szCs w:val="22"/>
         </w:rPr>
         <w:t xml:space="preserve"> </w:t>
       </w:r>
-      <w:r>
-        <w:rPr>
-          <w:color w:val="000000" w:themeColor="text1"/>
-          <w:sz w:val="22"/>
-          <w:szCs w:val="22"/>
-        </w:rPr>
-        <w:t xml:space="preserve">nesneler arasındaki ilişkileri ve ağları göstermek için kullanılabileceği anlatılmıştır. </w:t>
-      </w:r>
-      <w:proofErr w:type="spellStart"/>
-      <w:r>
-        <w:rPr>
-          <w:color w:val="000000" w:themeColor="text1"/>
-          <w:sz w:val="22"/>
-          <w:szCs w:val="22"/>
-        </w:rPr>
-        <w:t>Graphların</w:t>
-      </w:r>
-      <w:proofErr w:type="spellEnd"/>
-      <w:r>
-        <w:rPr>
-          <w:color w:val="000000" w:themeColor="text1"/>
-          <w:sz w:val="22"/>
-          <w:szCs w:val="22"/>
-        </w:rPr>
-        <w:t xml:space="preserve"> kullanılmasında yaygın olarak </w:t>
-      </w:r>
-      <w:proofErr w:type="spellStart"/>
-      <w:r>
-        <w:rPr>
-          <w:color w:val="000000" w:themeColor="text1"/>
-          <w:sz w:val="22"/>
-          <w:szCs w:val="22"/>
-        </w:rPr>
-        <w:t>adjacency</w:t>
-      </w:r>
-      <w:proofErr w:type="spellEnd"/>
-      <w:r>
-        <w:rPr>
-          <w:color w:val="000000" w:themeColor="text1"/>
-          <w:sz w:val="22"/>
-          <w:szCs w:val="22"/>
-        </w:rPr>
-        <w:t xml:space="preserve"> </w:t>
-      </w:r>
       <w:proofErr w:type="spellStart"/>
       <w:r>
         <w:rPr>
@@ -1607,95 +3009,97 @@
           <w:sz w:val="22"/>
           <w:szCs w:val="22"/>
         </w:rPr>
-        <w:t xml:space="preserve"> (komşuluk listesi) kullanılır ve bu yapıda her düğümün bağlı olduğu diğer düğümler bir liste içerisinde tutulur.</w:t>
-      </w:r>
-      <w:r>
-        <w:rPr>
-          <w:color w:val="auto"/>
-          <w:sz w:val="22"/>
-          <w:szCs w:val="22"/>
-        </w:rPr>
-        <w:t xml:space="preserve"> </w:t>
-      </w:r>
-      <w:r>
-        <w:rPr>
-          <w:color w:val="000000" w:themeColor="text1"/>
-          <w:sz w:val="22"/>
-          <w:szCs w:val="22"/>
-        </w:rPr>
-        <w:t xml:space="preserve">Daha sonra </w:t>
-      </w:r>
-      <w:proofErr w:type="spellStart"/>
-      <w:r>
-        <w:rPr>
-          <w:color w:val="000000" w:themeColor="text1"/>
-          <w:sz w:val="22"/>
-          <w:szCs w:val="22"/>
-        </w:rPr>
-        <w:t>linked</w:t>
-      </w:r>
-      <w:proofErr w:type="spellEnd"/>
-      <w:r>
-        <w:rPr>
-          <w:color w:val="000000" w:themeColor="text1"/>
-          <w:sz w:val="22"/>
-          <w:szCs w:val="22"/>
-        </w:rPr>
-        <w:t xml:space="preserve"> </w:t>
-      </w:r>
-      <w:proofErr w:type="spellStart"/>
-      <w:r>
-        <w:rPr>
-          <w:color w:val="000000" w:themeColor="text1"/>
-          <w:sz w:val="22"/>
-          <w:szCs w:val="22"/>
-        </w:rPr>
-        <w:t>listlerin</w:t>
-      </w:r>
-      <w:proofErr w:type="spellEnd"/>
-      <w:r>
-        <w:rPr>
-          <w:color w:val="000000" w:themeColor="text1"/>
-          <w:sz w:val="22"/>
-          <w:szCs w:val="22"/>
-        </w:rPr>
-        <w:t xml:space="preserve"> normal Python listelerinden farkları ve hangi işlemlerde daha avantajlı oldukları açıklanmıştır. Özellikle </w:t>
-      </w:r>
-      <w:proofErr w:type="spellStart"/>
-      <w:r>
-        <w:rPr>
-          <w:color w:val="000000" w:themeColor="text1"/>
-          <w:sz w:val="22"/>
-          <w:szCs w:val="22"/>
-        </w:rPr>
-        <w:t>linked</w:t>
-      </w:r>
-      <w:proofErr w:type="spellEnd"/>
-      <w:r>
-        <w:rPr>
-          <w:color w:val="000000" w:themeColor="text1"/>
-          <w:sz w:val="22"/>
-          <w:szCs w:val="22"/>
-        </w:rPr>
-        <w:t xml:space="preserve"> </w:t>
-      </w:r>
-      <w:proofErr w:type="spellStart"/>
-      <w:r>
-        <w:rPr>
-          <w:color w:val="000000" w:themeColor="text1"/>
-          <w:sz w:val="22"/>
-          <w:szCs w:val="22"/>
-        </w:rPr>
-        <w:t>listlerde</w:t>
-      </w:r>
-      <w:proofErr w:type="spellEnd"/>
-      <w:r>
-        <w:rPr>
-          <w:color w:val="000000" w:themeColor="text1"/>
-          <w:sz w:val="22"/>
-          <w:szCs w:val="22"/>
-        </w:rPr>
-        <w:t xml:space="preserve"> eleman ekleme ve silme işlemleri uygun konumlarda daha hızlı yapılabilirken, belirli bir elemana erişmek normal listelere göre daha yavaş olduğu anlatılmıştır.</w:t>
+        <w:t xml:space="preserve"> oluşturmak için </w:t>
+      </w:r>
+      <w:proofErr w:type="spellStart"/>
+      <w:r>
+        <w:rPr>
+          <w:color w:val="000000" w:themeColor="text1"/>
+          <w:sz w:val="22"/>
+          <w:szCs w:val="22"/>
+        </w:rPr>
+        <w:t>Node</w:t>
+      </w:r>
+      <w:proofErr w:type="spellEnd"/>
+      <w:r>
+        <w:rPr>
+          <w:color w:val="000000" w:themeColor="text1"/>
+          <w:sz w:val="22"/>
+          <w:szCs w:val="22"/>
+        </w:rPr>
+        <w:t xml:space="preserve"> ve </w:t>
+      </w:r>
+      <w:proofErr w:type="spellStart"/>
+      <w:r>
+        <w:rPr>
+          <w:color w:val="000000" w:themeColor="text1"/>
+          <w:sz w:val="22"/>
+          <w:szCs w:val="22"/>
+        </w:rPr>
+        <w:t>LinkedList</w:t>
+      </w:r>
+      <w:proofErr w:type="spellEnd"/>
+      <w:r>
+        <w:rPr>
+          <w:color w:val="000000" w:themeColor="text1"/>
+          <w:sz w:val="22"/>
+          <w:szCs w:val="22"/>
+        </w:rPr>
+        <w:t xml:space="preserve"> sınıfları kullanılabilir. Her </w:t>
+      </w:r>
+      <w:proofErr w:type="spellStart"/>
+      <w:r>
+        <w:rPr>
+          <w:color w:val="000000" w:themeColor="text1"/>
+          <w:sz w:val="22"/>
+          <w:szCs w:val="22"/>
+        </w:rPr>
+        <w:t>node</w:t>
+      </w:r>
+      <w:proofErr w:type="spellEnd"/>
+      <w:r>
+        <w:rPr>
+          <w:color w:val="000000" w:themeColor="text1"/>
+          <w:sz w:val="22"/>
+          <w:szCs w:val="22"/>
+        </w:rPr>
+        <w:t xml:space="preserve"> içerisinde verinin yanında bir sonraki </w:t>
+      </w:r>
+      <w:proofErr w:type="spellStart"/>
+      <w:r>
+        <w:rPr>
+          <w:color w:val="000000" w:themeColor="text1"/>
+          <w:sz w:val="22"/>
+          <w:szCs w:val="22"/>
+        </w:rPr>
+        <w:t>node'u</w:t>
+      </w:r>
+      <w:proofErr w:type="spellEnd"/>
+      <w:r>
+        <w:rPr>
+          <w:color w:val="000000" w:themeColor="text1"/>
+          <w:sz w:val="22"/>
+          <w:szCs w:val="22"/>
+        </w:rPr>
+        <w:t xml:space="preserve"> gösteren </w:t>
+      </w:r>
+      <w:proofErr w:type="spellStart"/>
+      <w:r>
+        <w:rPr>
+          <w:color w:val="000000" w:themeColor="text1"/>
+          <w:sz w:val="22"/>
+          <w:szCs w:val="22"/>
+        </w:rPr>
+        <w:t>next</w:t>
+      </w:r>
+      <w:proofErr w:type="spellEnd"/>
+      <w:r>
+        <w:rPr>
+          <w:color w:val="000000" w:themeColor="text1"/>
+          <w:sz w:val="22"/>
+          <w:szCs w:val="22"/>
+        </w:rPr>
+        <w:t xml:space="preserve"> bağlantısı bulunur. Bu yapı üzerinde listeyi dolaşma, başa veya sona eleman ekleme, belirli bir elemandan önce veya sonra yeni eleman ekleme ve eleman silme gibi işlemler yapılabilir.</w:t>
       </w:r>
     </w:p>
     <w:p>
@@ -1714,81 +3118,295 @@
           <w:sz w:val="22"/>
           <w:szCs w:val="22"/>
         </w:rPr>
-        <w:t xml:space="preserve">    Python'da </w:t>
-      </w:r>
-      <w:proofErr w:type="spellStart"/>
-      <w:proofErr w:type="gramStart"/>
-      <w:r>
-        <w:rPr>
-          <w:color w:val="000000" w:themeColor="text1"/>
-          <w:sz w:val="22"/>
-          <w:szCs w:val="22"/>
-        </w:rPr>
-        <w:t>collections.deque</w:t>
-      </w:r>
-      <w:proofErr w:type="spellEnd"/>
-      <w:proofErr w:type="gramEnd"/>
-      <w:r>
-        <w:rPr>
-          <w:color w:val="000000" w:themeColor="text1"/>
-          <w:sz w:val="22"/>
-          <w:szCs w:val="22"/>
-        </w:rPr>
-        <w:t xml:space="preserve"> yapısı, listenin hem başından hem de sonundan hızlı bir şekilde eleman ekleyip çıkarmak için kullanılabilir. Bu yüzden </w:t>
-      </w:r>
-      <w:proofErr w:type="spellStart"/>
-      <w:r>
-        <w:rPr>
-          <w:color w:val="000000" w:themeColor="text1"/>
-          <w:sz w:val="22"/>
-          <w:szCs w:val="22"/>
-        </w:rPr>
-        <w:t>queue</w:t>
-      </w:r>
-      <w:proofErr w:type="spellEnd"/>
-      <w:r>
-        <w:rPr>
-          <w:color w:val="000000" w:themeColor="text1"/>
-          <w:sz w:val="22"/>
-          <w:szCs w:val="22"/>
-        </w:rPr>
-        <w:t xml:space="preserve"> ve </w:t>
-      </w:r>
-      <w:proofErr w:type="spellStart"/>
-      <w:r>
-        <w:rPr>
-          <w:color w:val="000000" w:themeColor="text1"/>
-          <w:sz w:val="22"/>
-          <w:szCs w:val="22"/>
-        </w:rPr>
-        <w:t>stack</w:t>
-      </w:r>
-      <w:proofErr w:type="spellEnd"/>
-      <w:r>
-        <w:rPr>
-          <w:color w:val="000000" w:themeColor="text1"/>
-          <w:sz w:val="22"/>
-          <w:szCs w:val="22"/>
-        </w:rPr>
-        <w:t xml:space="preserve"> gibi veri yapılarında kullanışlıdır. Queue yapısında ilk giren eleman ilk çıkar (FIFO), </w:t>
-      </w:r>
-      <w:proofErr w:type="spellStart"/>
-      <w:r>
-        <w:rPr>
-          <w:color w:val="000000" w:themeColor="text1"/>
-          <w:sz w:val="22"/>
-          <w:szCs w:val="22"/>
-        </w:rPr>
-        <w:t>Stack</w:t>
-      </w:r>
-      <w:proofErr w:type="spellEnd"/>
-      <w:r>
-        <w:rPr>
-          <w:color w:val="000000" w:themeColor="text1"/>
-          <w:sz w:val="22"/>
-          <w:szCs w:val="22"/>
-        </w:rPr>
-        <w:t xml:space="preserve"> yapısında ise son giren eleman ilk çıkar (LIFO).</w:t>
+        <w:t xml:space="preserve">    </w:t>
+      </w:r>
+      <w:proofErr w:type="spellStart"/>
+      <w:r>
+        <w:rPr>
+          <w:color w:val="000000" w:themeColor="text1"/>
+          <w:sz w:val="22"/>
+          <w:szCs w:val="22"/>
+        </w:rPr>
+        <w:t>Linked</w:t>
+      </w:r>
+      <w:proofErr w:type="spellEnd"/>
+      <w:r>
+        <w:rPr>
+          <w:color w:val="000000" w:themeColor="text1"/>
+          <w:sz w:val="22"/>
+          <w:szCs w:val="22"/>
+        </w:rPr>
+        <w:t xml:space="preserve"> </w:t>
+      </w:r>
+      <w:proofErr w:type="spellStart"/>
+      <w:r>
+        <w:rPr>
+          <w:color w:val="000000" w:themeColor="text1"/>
+          <w:sz w:val="22"/>
+          <w:szCs w:val="22"/>
+        </w:rPr>
+        <w:t>listlerin</w:t>
+      </w:r>
+      <w:proofErr w:type="spellEnd"/>
+      <w:r>
+        <w:rPr>
+          <w:color w:val="000000" w:themeColor="text1"/>
+          <w:sz w:val="22"/>
+          <w:szCs w:val="22"/>
+        </w:rPr>
+        <w:t xml:space="preserve"> farklı türleri de bulunmaktadır. </w:t>
+      </w:r>
+      <w:proofErr w:type="spellStart"/>
+      <w:r>
+        <w:rPr>
+          <w:color w:val="000000" w:themeColor="text1"/>
+          <w:sz w:val="22"/>
+          <w:szCs w:val="22"/>
+        </w:rPr>
+        <w:t>Singly</w:t>
+      </w:r>
+      <w:proofErr w:type="spellEnd"/>
+      <w:r>
+        <w:rPr>
+          <w:color w:val="000000" w:themeColor="text1"/>
+          <w:sz w:val="22"/>
+          <w:szCs w:val="22"/>
+        </w:rPr>
+        <w:t xml:space="preserve"> </w:t>
+      </w:r>
+      <w:proofErr w:type="spellStart"/>
+      <w:r>
+        <w:rPr>
+          <w:color w:val="000000" w:themeColor="text1"/>
+          <w:sz w:val="22"/>
+          <w:szCs w:val="22"/>
+        </w:rPr>
+        <w:t>linked</w:t>
+      </w:r>
+      <w:proofErr w:type="spellEnd"/>
+      <w:r>
+        <w:rPr>
+          <w:color w:val="000000" w:themeColor="text1"/>
+          <w:sz w:val="22"/>
+          <w:szCs w:val="22"/>
+        </w:rPr>
+        <w:t xml:space="preserve"> </w:t>
+      </w:r>
+      <w:proofErr w:type="spellStart"/>
+      <w:r>
+        <w:rPr>
+          <w:color w:val="000000" w:themeColor="text1"/>
+          <w:sz w:val="22"/>
+          <w:szCs w:val="22"/>
+        </w:rPr>
+        <w:t>listlerde</w:t>
+      </w:r>
+      <w:proofErr w:type="spellEnd"/>
+      <w:r>
+        <w:rPr>
+          <w:color w:val="000000" w:themeColor="text1"/>
+          <w:sz w:val="22"/>
+          <w:szCs w:val="22"/>
+        </w:rPr>
+        <w:t xml:space="preserve"> her </w:t>
+      </w:r>
+      <w:proofErr w:type="spellStart"/>
+      <w:r>
+        <w:rPr>
+          <w:color w:val="000000" w:themeColor="text1"/>
+          <w:sz w:val="22"/>
+          <w:szCs w:val="22"/>
+        </w:rPr>
+        <w:t>node</w:t>
+      </w:r>
+      <w:proofErr w:type="spellEnd"/>
+      <w:r>
+        <w:rPr>
+          <w:color w:val="000000" w:themeColor="text1"/>
+          <w:sz w:val="22"/>
+          <w:szCs w:val="22"/>
+        </w:rPr>
+        <w:t xml:space="preserve"> yalnızca sonraki </w:t>
+      </w:r>
+      <w:proofErr w:type="spellStart"/>
+      <w:r>
+        <w:rPr>
+          <w:color w:val="000000" w:themeColor="text1"/>
+          <w:sz w:val="22"/>
+          <w:szCs w:val="22"/>
+        </w:rPr>
+        <w:t>node'u</w:t>
+      </w:r>
+      <w:proofErr w:type="spellEnd"/>
+      <w:r>
+        <w:rPr>
+          <w:color w:val="000000" w:themeColor="text1"/>
+          <w:sz w:val="22"/>
+          <w:szCs w:val="22"/>
+        </w:rPr>
+        <w:t xml:space="preserve"> gösterirken, </w:t>
+      </w:r>
+      <w:proofErr w:type="spellStart"/>
+      <w:r>
+        <w:rPr>
+          <w:color w:val="000000" w:themeColor="text1"/>
+          <w:sz w:val="22"/>
+          <w:szCs w:val="22"/>
+        </w:rPr>
+        <w:t>doubly</w:t>
+      </w:r>
+      <w:proofErr w:type="spellEnd"/>
+      <w:r>
+        <w:rPr>
+          <w:color w:val="000000" w:themeColor="text1"/>
+          <w:sz w:val="22"/>
+          <w:szCs w:val="22"/>
+        </w:rPr>
+        <w:t xml:space="preserve"> </w:t>
+      </w:r>
+      <w:proofErr w:type="spellStart"/>
+      <w:r>
+        <w:rPr>
+          <w:color w:val="000000" w:themeColor="text1"/>
+          <w:sz w:val="22"/>
+          <w:szCs w:val="22"/>
+        </w:rPr>
+        <w:t>linked</w:t>
+      </w:r>
+      <w:proofErr w:type="spellEnd"/>
+      <w:r>
+        <w:rPr>
+          <w:color w:val="000000" w:themeColor="text1"/>
+          <w:sz w:val="22"/>
+          <w:szCs w:val="22"/>
+        </w:rPr>
+        <w:t xml:space="preserve"> </w:t>
+      </w:r>
+      <w:proofErr w:type="spellStart"/>
+      <w:r>
+        <w:rPr>
+          <w:color w:val="000000" w:themeColor="text1"/>
+          <w:sz w:val="22"/>
+          <w:szCs w:val="22"/>
+        </w:rPr>
+        <w:t>listlerde</w:t>
+      </w:r>
+      <w:proofErr w:type="spellEnd"/>
+      <w:r>
+        <w:rPr>
+          <w:color w:val="000000" w:themeColor="text1"/>
+          <w:sz w:val="22"/>
+          <w:szCs w:val="22"/>
+        </w:rPr>
+        <w:t xml:space="preserve"> hem önceki hem de sonraki </w:t>
+      </w:r>
+      <w:proofErr w:type="spellStart"/>
+      <w:r>
+        <w:rPr>
+          <w:color w:val="000000" w:themeColor="text1"/>
+          <w:sz w:val="22"/>
+          <w:szCs w:val="22"/>
+        </w:rPr>
+        <w:t>node'a</w:t>
+      </w:r>
+      <w:proofErr w:type="spellEnd"/>
+      <w:r>
+        <w:rPr>
+          <w:color w:val="000000" w:themeColor="text1"/>
+          <w:sz w:val="22"/>
+          <w:szCs w:val="22"/>
+        </w:rPr>
+        <w:t xml:space="preserve"> bağlantı bulunur. </w:t>
+      </w:r>
+      <w:proofErr w:type="spellStart"/>
+      <w:r>
+        <w:rPr>
+          <w:color w:val="000000" w:themeColor="text1"/>
+          <w:sz w:val="22"/>
+          <w:szCs w:val="22"/>
+        </w:rPr>
+        <w:t>Circular</w:t>
+      </w:r>
+      <w:proofErr w:type="spellEnd"/>
+      <w:r>
+        <w:rPr>
+          <w:color w:val="000000" w:themeColor="text1"/>
+          <w:sz w:val="22"/>
+          <w:szCs w:val="22"/>
+        </w:rPr>
+        <w:t xml:space="preserve"> </w:t>
+      </w:r>
+      <w:proofErr w:type="spellStart"/>
+      <w:r>
+        <w:rPr>
+          <w:color w:val="000000" w:themeColor="text1"/>
+          <w:sz w:val="22"/>
+          <w:szCs w:val="22"/>
+        </w:rPr>
+        <w:t>linked</w:t>
+      </w:r>
+      <w:proofErr w:type="spellEnd"/>
+      <w:r>
+        <w:rPr>
+          <w:color w:val="000000" w:themeColor="text1"/>
+          <w:sz w:val="22"/>
+          <w:szCs w:val="22"/>
+        </w:rPr>
+        <w:t xml:space="preserve"> </w:t>
+      </w:r>
+      <w:proofErr w:type="spellStart"/>
+      <w:r>
+        <w:rPr>
+          <w:color w:val="000000" w:themeColor="text1"/>
+          <w:sz w:val="22"/>
+          <w:szCs w:val="22"/>
+        </w:rPr>
+        <w:t>listlerde</w:t>
+      </w:r>
+      <w:proofErr w:type="spellEnd"/>
+      <w:r>
+        <w:rPr>
+          <w:color w:val="000000" w:themeColor="text1"/>
+          <w:sz w:val="22"/>
+          <w:szCs w:val="22"/>
+        </w:rPr>
+        <w:t xml:space="preserve"> ise son </w:t>
+      </w:r>
+      <w:proofErr w:type="spellStart"/>
+      <w:r>
+        <w:rPr>
+          <w:color w:val="000000" w:themeColor="text1"/>
+          <w:sz w:val="22"/>
+          <w:szCs w:val="22"/>
+        </w:rPr>
+        <w:t>node</w:t>
+      </w:r>
+      <w:proofErr w:type="spellEnd"/>
+      <w:r>
+        <w:rPr>
+          <w:color w:val="000000" w:themeColor="text1"/>
+          <w:sz w:val="22"/>
+          <w:szCs w:val="22"/>
+        </w:rPr>
+        <w:t xml:space="preserve"> tekrar ilk </w:t>
+      </w:r>
+      <w:proofErr w:type="spellStart"/>
+      <w:r>
+        <w:rPr>
+          <w:color w:val="000000" w:themeColor="text1"/>
+          <w:sz w:val="22"/>
+          <w:szCs w:val="22"/>
+        </w:rPr>
+        <w:t>node'a</w:t>
+      </w:r>
+      <w:proofErr w:type="spellEnd"/>
+      <w:r>
+        <w:rPr>
+          <w:color w:val="000000" w:themeColor="text1"/>
+          <w:sz w:val="22"/>
+          <w:szCs w:val="22"/>
+        </w:rPr>
+        <w:t xml:space="preserve"> bağlanır. Bu yapıların kullanım şekilleri ihtiyaca göre değişmektedir.</w:t>
       </w:r>
     </w:p>
     <w:p>
@@ -1807,16 +3425,16 @@
           <w:sz w:val="22"/>
           <w:szCs w:val="22"/>
         </w:rPr>
-        <w:t xml:space="preserve">    </w:t>
-      </w:r>
-      <w:proofErr w:type="spellStart"/>
-      <w:r>
-        <w:rPr>
-          <w:color w:val="000000" w:themeColor="text1"/>
-          <w:sz w:val="22"/>
-          <w:szCs w:val="22"/>
-        </w:rPr>
-        <w:t>Linked</w:t>
+        <w:t xml:space="preserve">    Özet olarak, </w:t>
+      </w:r>
+      <w:proofErr w:type="spellStart"/>
+      <w:r>
+        <w:rPr>
+          <w:color w:val="000000" w:themeColor="text1"/>
+          <w:sz w:val="22"/>
+          <w:szCs w:val="22"/>
+        </w:rPr>
+        <w:t>linked</w:t>
       </w:r>
       <w:proofErr w:type="spellEnd"/>
       <w:r>
@@ -1834,106 +3452,34 @@
           <w:sz w:val="22"/>
           <w:szCs w:val="22"/>
         </w:rPr>
-        <w:t>list</w:t>
-      </w:r>
-      <w:proofErr w:type="spellEnd"/>
-      <w:r>
-        <w:rPr>
-          <w:color w:val="000000" w:themeColor="text1"/>
-          <w:sz w:val="22"/>
-          <w:szCs w:val="22"/>
-        </w:rPr>
-        <w:t xml:space="preserve"> oluşturmak için </w:t>
-      </w:r>
-      <w:proofErr w:type="spellStart"/>
-      <w:r>
-        <w:rPr>
-          <w:color w:val="000000" w:themeColor="text1"/>
-          <w:sz w:val="22"/>
-          <w:szCs w:val="22"/>
-        </w:rPr>
-        <w:t>Node</w:t>
-      </w:r>
-      <w:proofErr w:type="spellEnd"/>
-      <w:r>
-        <w:rPr>
-          <w:color w:val="000000" w:themeColor="text1"/>
-          <w:sz w:val="22"/>
-          <w:szCs w:val="22"/>
-        </w:rPr>
-        <w:t xml:space="preserve"> ve </w:t>
-      </w:r>
-      <w:proofErr w:type="spellStart"/>
-      <w:r>
-        <w:rPr>
-          <w:color w:val="000000" w:themeColor="text1"/>
-          <w:sz w:val="22"/>
-          <w:szCs w:val="22"/>
-        </w:rPr>
-        <w:t>LinkedList</w:t>
-      </w:r>
-      <w:proofErr w:type="spellEnd"/>
-      <w:r>
-        <w:rPr>
-          <w:color w:val="000000" w:themeColor="text1"/>
-          <w:sz w:val="22"/>
-          <w:szCs w:val="22"/>
-        </w:rPr>
-        <w:t xml:space="preserve"> sınıfları kullanılabilir. Her </w:t>
-      </w:r>
-      <w:proofErr w:type="spellStart"/>
-      <w:r>
-        <w:rPr>
-          <w:color w:val="000000" w:themeColor="text1"/>
-          <w:sz w:val="22"/>
-          <w:szCs w:val="22"/>
-        </w:rPr>
-        <w:t>node</w:t>
-      </w:r>
-      <w:proofErr w:type="spellEnd"/>
-      <w:r>
-        <w:rPr>
-          <w:color w:val="000000" w:themeColor="text1"/>
-          <w:sz w:val="22"/>
-          <w:szCs w:val="22"/>
-        </w:rPr>
-        <w:t xml:space="preserve"> içerisinde verinin yanında bir sonraki </w:t>
-      </w:r>
-      <w:proofErr w:type="spellStart"/>
-      <w:r>
-        <w:rPr>
-          <w:color w:val="000000" w:themeColor="text1"/>
-          <w:sz w:val="22"/>
-          <w:szCs w:val="22"/>
-        </w:rPr>
-        <w:t>node'u</w:t>
-      </w:r>
-      <w:proofErr w:type="spellEnd"/>
-      <w:r>
-        <w:rPr>
-          <w:color w:val="000000" w:themeColor="text1"/>
-          <w:sz w:val="22"/>
-          <w:szCs w:val="22"/>
-        </w:rPr>
-        <w:t xml:space="preserve"> gösteren </w:t>
-      </w:r>
-      <w:proofErr w:type="spellStart"/>
-      <w:r>
-        <w:rPr>
-          <w:color w:val="000000" w:themeColor="text1"/>
-          <w:sz w:val="22"/>
-          <w:szCs w:val="22"/>
-        </w:rPr>
-        <w:t>next</w:t>
-      </w:r>
-      <w:proofErr w:type="spellEnd"/>
-      <w:r>
-        <w:rPr>
-          <w:color w:val="000000" w:themeColor="text1"/>
-          <w:sz w:val="22"/>
-          <w:szCs w:val="22"/>
-        </w:rPr>
-        <w:t xml:space="preserve"> bağlantısı bulunur. Bu yapı üzerinde listeyi dolaşma, başa veya sona eleman ekleme, belirli bir elemandan önce veya sonra yeni eleman ekleme ve eleman silme gibi işlemler yapılabilir.</w:t>
+        <w:t>listler</w:t>
+      </w:r>
+      <w:proofErr w:type="spellEnd"/>
+      <w:r>
+        <w:rPr>
+          <w:color w:val="000000" w:themeColor="text1"/>
+          <w:sz w:val="22"/>
+          <w:szCs w:val="22"/>
+        </w:rPr>
+        <w:t xml:space="preserve"> eleman ekleme, silme ve liste üzerinde dolaşma gibi işlemlerde farklı avantajlar sunan, Queue ve </w:t>
+      </w:r>
+      <w:proofErr w:type="spellStart"/>
+      <w:r>
+        <w:rPr>
+          <w:color w:val="000000" w:themeColor="text1"/>
+          <w:sz w:val="22"/>
+          <w:szCs w:val="22"/>
+        </w:rPr>
+        <w:t>Stack</w:t>
+      </w:r>
+      <w:proofErr w:type="spellEnd"/>
+      <w:r>
+        <w:rPr>
+          <w:color w:val="000000" w:themeColor="text1"/>
+          <w:sz w:val="22"/>
+          <w:szCs w:val="22"/>
+        </w:rPr>
+        <w:t xml:space="preserve"> gibi veri yapılarının oluşturulmasında da kullanılabilen önemli bir veri yapısıdır.</w:t>
       </w:r>
     </w:p>
     <w:p>
@@ -1942,412 +3488,13 @@
         <w:spacing w:before="300" w:after="150"/>
         <w:rPr>
           <w:color w:val="000000" w:themeColor="text1"/>
-          <w:sz w:val="22"/>
-          <w:szCs w:val="22"/>
         </w:rPr>
       </w:pPr>
       <w:r>
         <w:rPr>
           <w:color w:val="000000" w:themeColor="text1"/>
-          <w:sz w:val="22"/>
-          <w:szCs w:val="22"/>
-        </w:rPr>
-        <w:t xml:space="preserve">    </w:t>
-      </w:r>
-      <w:proofErr w:type="spellStart"/>
-      <w:r>
-        <w:rPr>
-          <w:color w:val="000000" w:themeColor="text1"/>
-          <w:sz w:val="22"/>
-          <w:szCs w:val="22"/>
-        </w:rPr>
-        <w:t>Linked</w:t>
-      </w:r>
-      <w:proofErr w:type="spellEnd"/>
-      <w:r>
-        <w:rPr>
-          <w:color w:val="000000" w:themeColor="text1"/>
-          <w:sz w:val="22"/>
-          <w:szCs w:val="22"/>
-        </w:rPr>
-        <w:t xml:space="preserve"> </w:t>
-      </w:r>
-      <w:proofErr w:type="spellStart"/>
-      <w:r>
-        <w:rPr>
-          <w:color w:val="000000" w:themeColor="text1"/>
-          <w:sz w:val="22"/>
-          <w:szCs w:val="22"/>
-        </w:rPr>
-        <w:t>listlerin</w:t>
-      </w:r>
-      <w:proofErr w:type="spellEnd"/>
-      <w:r>
-        <w:rPr>
-          <w:color w:val="000000" w:themeColor="text1"/>
-          <w:sz w:val="22"/>
-          <w:szCs w:val="22"/>
-        </w:rPr>
-        <w:t xml:space="preserve"> farklı türleri de bulunmaktadır. </w:t>
-      </w:r>
-      <w:proofErr w:type="spellStart"/>
-      <w:r>
-        <w:rPr>
-          <w:color w:val="000000" w:themeColor="text1"/>
-          <w:sz w:val="22"/>
-          <w:szCs w:val="22"/>
-        </w:rPr>
-        <w:t>Singly</w:t>
-      </w:r>
-      <w:proofErr w:type="spellEnd"/>
-      <w:r>
-        <w:rPr>
-          <w:color w:val="000000" w:themeColor="text1"/>
-          <w:sz w:val="22"/>
-          <w:szCs w:val="22"/>
-        </w:rPr>
-        <w:t xml:space="preserve"> </w:t>
-      </w:r>
-      <w:proofErr w:type="spellStart"/>
-      <w:r>
-        <w:rPr>
-          <w:color w:val="000000" w:themeColor="text1"/>
-          <w:sz w:val="22"/>
-          <w:szCs w:val="22"/>
-        </w:rPr>
-        <w:t>linked</w:t>
-      </w:r>
-      <w:proofErr w:type="spellEnd"/>
-      <w:r>
-        <w:rPr>
-          <w:color w:val="000000" w:themeColor="text1"/>
-          <w:sz w:val="22"/>
-          <w:szCs w:val="22"/>
-        </w:rPr>
-        <w:t xml:space="preserve"> </w:t>
-      </w:r>
-      <w:proofErr w:type="spellStart"/>
-      <w:r>
-        <w:rPr>
-          <w:color w:val="000000" w:themeColor="text1"/>
-          <w:sz w:val="22"/>
-          <w:szCs w:val="22"/>
-        </w:rPr>
-        <w:t>listlerde</w:t>
-      </w:r>
-      <w:proofErr w:type="spellEnd"/>
-      <w:r>
-        <w:rPr>
-          <w:color w:val="000000" w:themeColor="text1"/>
-          <w:sz w:val="22"/>
-          <w:szCs w:val="22"/>
-        </w:rPr>
-        <w:t xml:space="preserve"> her </w:t>
-      </w:r>
-      <w:proofErr w:type="spellStart"/>
-      <w:r>
-        <w:rPr>
-          <w:color w:val="000000" w:themeColor="text1"/>
-          <w:sz w:val="22"/>
-          <w:szCs w:val="22"/>
-        </w:rPr>
-        <w:t>node</w:t>
-      </w:r>
-      <w:proofErr w:type="spellEnd"/>
-      <w:r>
-        <w:rPr>
-          <w:color w:val="000000" w:themeColor="text1"/>
-          <w:sz w:val="22"/>
-          <w:szCs w:val="22"/>
-        </w:rPr>
-        <w:t xml:space="preserve"> yalnızca sonraki </w:t>
-      </w:r>
-      <w:proofErr w:type="spellStart"/>
-      <w:r>
-        <w:rPr>
-          <w:color w:val="000000" w:themeColor="text1"/>
-          <w:sz w:val="22"/>
-          <w:szCs w:val="22"/>
-        </w:rPr>
-        <w:t>node'u</w:t>
-      </w:r>
-      <w:proofErr w:type="spellEnd"/>
-      <w:r>
-        <w:rPr>
-          <w:color w:val="000000" w:themeColor="text1"/>
-          <w:sz w:val="22"/>
-          <w:szCs w:val="22"/>
-        </w:rPr>
-        <w:t xml:space="preserve"> gösterirken, </w:t>
-      </w:r>
-      <w:proofErr w:type="spellStart"/>
-      <w:r>
-        <w:rPr>
-          <w:color w:val="000000" w:themeColor="text1"/>
-          <w:sz w:val="22"/>
-          <w:szCs w:val="22"/>
-        </w:rPr>
-        <w:t>doubly</w:t>
-      </w:r>
-      <w:proofErr w:type="spellEnd"/>
-      <w:r>
-        <w:rPr>
-          <w:color w:val="000000" w:themeColor="text1"/>
-          <w:sz w:val="22"/>
-          <w:szCs w:val="22"/>
-        </w:rPr>
-        <w:t xml:space="preserve"> </w:t>
-      </w:r>
-      <w:proofErr w:type="spellStart"/>
-      <w:r>
-        <w:rPr>
-          <w:color w:val="000000" w:themeColor="text1"/>
-          <w:sz w:val="22"/>
-          <w:szCs w:val="22"/>
-        </w:rPr>
-        <w:t>linked</w:t>
-      </w:r>
-      <w:proofErr w:type="spellEnd"/>
-      <w:r>
-        <w:rPr>
-          <w:color w:val="000000" w:themeColor="text1"/>
-          <w:sz w:val="22"/>
-          <w:szCs w:val="22"/>
-        </w:rPr>
-        <w:t xml:space="preserve"> </w:t>
-      </w:r>
-      <w:proofErr w:type="spellStart"/>
-      <w:r>
-        <w:rPr>
-          <w:color w:val="000000" w:themeColor="text1"/>
-          <w:sz w:val="22"/>
-          <w:szCs w:val="22"/>
-        </w:rPr>
-        <w:t>listlerde</w:t>
-      </w:r>
-      <w:proofErr w:type="spellEnd"/>
-      <w:r>
-        <w:rPr>
-          <w:color w:val="000000" w:themeColor="text1"/>
-          <w:sz w:val="22"/>
-          <w:szCs w:val="22"/>
-        </w:rPr>
-        <w:t xml:space="preserve"> hem önceki hem de sonraki </w:t>
-      </w:r>
-      <w:proofErr w:type="spellStart"/>
-      <w:r>
-        <w:rPr>
-          <w:color w:val="000000" w:themeColor="text1"/>
-          <w:sz w:val="22"/>
-          <w:szCs w:val="22"/>
-        </w:rPr>
-        <w:t>node'a</w:t>
-      </w:r>
-      <w:proofErr w:type="spellEnd"/>
-      <w:r>
-        <w:rPr>
-          <w:color w:val="000000" w:themeColor="text1"/>
-          <w:sz w:val="22"/>
-          <w:szCs w:val="22"/>
-        </w:rPr>
-        <w:t xml:space="preserve"> bağlantı bulunur. </w:t>
-      </w:r>
-      <w:proofErr w:type="spellStart"/>
-      <w:r>
-        <w:rPr>
-          <w:color w:val="000000" w:themeColor="text1"/>
-          <w:sz w:val="22"/>
-          <w:szCs w:val="22"/>
-        </w:rPr>
-        <w:t>Circular</w:t>
-      </w:r>
-      <w:proofErr w:type="spellEnd"/>
-      <w:r>
-        <w:rPr>
-          <w:color w:val="000000" w:themeColor="text1"/>
-          <w:sz w:val="22"/>
-          <w:szCs w:val="22"/>
-        </w:rPr>
-        <w:t xml:space="preserve"> </w:t>
-      </w:r>
-      <w:proofErr w:type="spellStart"/>
-      <w:r>
-        <w:rPr>
-          <w:color w:val="000000" w:themeColor="text1"/>
-          <w:sz w:val="22"/>
-          <w:szCs w:val="22"/>
-        </w:rPr>
-        <w:t>linked</w:t>
-      </w:r>
-      <w:proofErr w:type="spellEnd"/>
-      <w:r>
-        <w:rPr>
-          <w:color w:val="000000" w:themeColor="text1"/>
-          <w:sz w:val="22"/>
-          <w:szCs w:val="22"/>
-        </w:rPr>
-        <w:t xml:space="preserve"> </w:t>
-      </w:r>
-      <w:proofErr w:type="spellStart"/>
-      <w:r>
-        <w:rPr>
-          <w:color w:val="000000" w:themeColor="text1"/>
-          <w:sz w:val="22"/>
-          <w:szCs w:val="22"/>
-        </w:rPr>
-        <w:t>listlerde</w:t>
-      </w:r>
-      <w:proofErr w:type="spellEnd"/>
-      <w:r>
-        <w:rPr>
-          <w:color w:val="000000" w:themeColor="text1"/>
-          <w:sz w:val="22"/>
-          <w:szCs w:val="22"/>
-        </w:rPr>
-        <w:t xml:space="preserve"> ise son </w:t>
-      </w:r>
-      <w:proofErr w:type="spellStart"/>
-      <w:r>
-        <w:rPr>
-          <w:color w:val="000000" w:themeColor="text1"/>
-          <w:sz w:val="22"/>
-          <w:szCs w:val="22"/>
-        </w:rPr>
-        <w:t>node</w:t>
-      </w:r>
-      <w:proofErr w:type="spellEnd"/>
-      <w:r>
-        <w:rPr>
-          <w:color w:val="000000" w:themeColor="text1"/>
-          <w:sz w:val="22"/>
-          <w:szCs w:val="22"/>
-        </w:rPr>
-        <w:t xml:space="preserve"> tekrar ilk </w:t>
-      </w:r>
-      <w:proofErr w:type="spellStart"/>
-      <w:r>
-        <w:rPr>
-          <w:color w:val="000000" w:themeColor="text1"/>
-          <w:sz w:val="22"/>
-          <w:szCs w:val="22"/>
-        </w:rPr>
-        <w:t>node'a</w:t>
-      </w:r>
-      <w:proofErr w:type="spellEnd"/>
-      <w:r>
-        <w:rPr>
-          <w:color w:val="000000" w:themeColor="text1"/>
-          <w:sz w:val="22"/>
-          <w:szCs w:val="22"/>
-        </w:rPr>
-        <w:t xml:space="preserve"> bağlanır. Bu yapıların kullanım şekilleri ihtiyaca göre değişmektedir.</w:t>
-      </w:r>
-    </w:p>
-    <w:p>
-      <w:pPr>
-        <w:pStyle w:val="Balk1"/>
-        <w:spacing w:before="300" w:after="150"/>
-        <w:rPr>
-          <w:color w:val="000000" w:themeColor="text1"/>
-          <w:sz w:val="22"/>
-          <w:szCs w:val="22"/>
-        </w:rPr>
-      </w:pPr>
-      <w:r>
-        <w:rPr>
-          <w:color w:val="000000" w:themeColor="text1"/>
-          <w:sz w:val="22"/>
-          <w:szCs w:val="22"/>
-        </w:rPr>
-        <w:t xml:space="preserve">    Özet olarak, </w:t>
-      </w:r>
-      <w:proofErr w:type="spellStart"/>
-      <w:r>
-        <w:rPr>
-          <w:color w:val="000000" w:themeColor="text1"/>
-          <w:sz w:val="22"/>
-          <w:szCs w:val="22"/>
-        </w:rPr>
-        <w:t>linked</w:t>
-      </w:r>
-      <w:proofErr w:type="spellEnd"/>
-      <w:r>
-        <w:rPr>
-          <w:color w:val="000000" w:themeColor="text1"/>
-          <w:sz w:val="22"/>
-          <w:szCs w:val="22"/>
-        </w:rPr>
-        <w:t xml:space="preserve"> </w:t>
-      </w:r>
-      <w:proofErr w:type="spellStart"/>
-      <w:r>
-        <w:rPr>
-          <w:color w:val="000000" w:themeColor="text1"/>
-          <w:sz w:val="22"/>
-          <w:szCs w:val="22"/>
-        </w:rPr>
-        <w:t>listler</w:t>
-      </w:r>
-      <w:proofErr w:type="spellEnd"/>
-      <w:r>
-        <w:rPr>
-          <w:color w:val="000000" w:themeColor="text1"/>
-          <w:sz w:val="22"/>
-          <w:szCs w:val="22"/>
-        </w:rPr>
-        <w:t xml:space="preserve"> eleman ekleme, silme ve liste üzerinde dolaşma gibi işlemlerde farklı avantajlar sunan, Queue ve </w:t>
-      </w:r>
-      <w:proofErr w:type="spellStart"/>
-      <w:r>
-        <w:rPr>
-          <w:color w:val="000000" w:themeColor="text1"/>
-          <w:sz w:val="22"/>
-          <w:szCs w:val="22"/>
-        </w:rPr>
-        <w:t>Stack</w:t>
-      </w:r>
-      <w:proofErr w:type="spellEnd"/>
-      <w:r>
-        <w:rPr>
-          <w:color w:val="000000" w:themeColor="text1"/>
-          <w:sz w:val="22"/>
-          <w:szCs w:val="22"/>
-        </w:rPr>
-        <w:t xml:space="preserve"> gibi veri yapılarının oluşturulmasında da kullanılabilen önemli bir veri yapısıdır.</w:t>
-      </w:r>
-    </w:p>
-    <w:p>
-      <w:pPr>
-        <w:pStyle w:val="Balk1"/>
-        <w:spacing w:before="300" w:after="150"/>
-        <w:rPr>
-          <w:color w:val="000000" w:themeColor="text1"/>
-          <w:sz w:val="22"/>
-          <w:szCs w:val="22"/>
-        </w:rPr>
-      </w:pPr>
-    </w:p>
-    <w:p>
-      <w:pPr>
-        <w:pStyle w:val="Balk1"/>
-        <w:spacing w:before="300" w:after="150"/>
-        <w:rPr>
-          <w:color w:val="000000" w:themeColor="text1"/>
-        </w:rPr>
-      </w:pPr>
-    </w:p>
-    <w:p>
-      <w:pPr>
-        <w:pStyle w:val="Balk1"/>
-        <w:spacing w:before="300" w:after="150"/>
-        <w:rPr>
-          <w:color w:val="000000" w:themeColor="text1"/>
-        </w:rPr>
-      </w:pPr>
-      <w:r>
-        <w:rPr>
-          <w:color w:val="000000" w:themeColor="text1"/>
-        </w:rPr>
+        </w:rPr>
+        <w:lastRenderedPageBreak/>
         <w:t>4. Uyku Takip Tablosu</w:t>
       </w:r>
     </w:p>
@@ -2859,6 +4006,12 @@
                 <w:color w:val="000000" w:themeColor="text1"/>
               </w:rPr>
             </w:pPr>
+            <w:r>
+              <w:rPr>
+                <w:color w:val="000000" w:themeColor="text1"/>
+              </w:rPr>
+              <w:t>23.00</w:t>
+            </w:r>
           </w:p>
         </w:tc>
         <w:tc>
@@ -2871,6 +4024,12 @@
                 <w:color w:val="000000" w:themeColor="text1"/>
               </w:rPr>
             </w:pPr>
+            <w:r>
+              <w:rPr>
+                <w:color w:val="000000" w:themeColor="text1"/>
+              </w:rPr>
+              <w:t>8.00</w:t>
+            </w:r>
           </w:p>
         </w:tc>
         <w:tc>
@@ -2883,6 +4042,12 @@
                 <w:color w:val="000000" w:themeColor="text1"/>
               </w:rPr>
             </w:pPr>
+            <w:r>
+              <w:rPr>
+                <w:color w:val="000000" w:themeColor="text1"/>
+              </w:rPr>
+              <w:t>9.00</w:t>
+            </w:r>
           </w:p>
         </w:tc>
       </w:tr>
@@ -2915,6 +4080,12 @@
                 <w:color w:val="000000" w:themeColor="text1"/>
               </w:rPr>
             </w:pPr>
+            <w:r>
+              <w:rPr>
+                <w:color w:val="000000" w:themeColor="text1"/>
+              </w:rPr>
+              <w:t>01.00</w:t>
+            </w:r>
           </w:p>
         </w:tc>
         <w:tc>
@@ -2927,6 +4098,12 @@
                 <w:color w:val="000000" w:themeColor="text1"/>
               </w:rPr>
             </w:pPr>
+            <w:r>
+              <w:rPr>
+                <w:color w:val="000000" w:themeColor="text1"/>
+              </w:rPr>
+              <w:t>10.30</w:t>
+            </w:r>
           </w:p>
         </w:tc>
         <w:tc>
@@ -2939,6 +4116,12 @@
                 <w:color w:val="000000" w:themeColor="text1"/>
               </w:rPr>
             </w:pPr>
+            <w:r>
+              <w:rPr>
+                <w:color w:val="000000" w:themeColor="text1"/>
+              </w:rPr>
+              <w:t>9.30</w:t>
+            </w:r>
           </w:p>
         </w:tc>
       </w:tr>
@@ -2950,6 +4133,21 @@
           <w:color w:val="000000" w:themeColor="text1"/>
         </w:rPr>
       </w:pPr>
+      <w:r>
+        <w:rPr>
+          <w:color w:val="000000" w:themeColor="text1"/>
+        </w:rPr>
+        <w:t>Ortalama:</w:t>
+      </w:r>
+      <w:r>
+        <w:t xml:space="preserve"> </w:t>
+      </w:r>
+      <w:r>
+        <w:rPr>
+          <w:color w:val="000000" w:themeColor="text1"/>
+        </w:rPr>
+        <w:t>8 saat 41 dakika</w:t>
+      </w:r>
     </w:p>
     <w:p>
       <w:pPr>
@@ -2959,12 +4157,6 @@
           <w:color w:val="000000" w:themeColor="text1"/>
         </w:rPr>
       </w:pPr>
-      <w:r>
-        <w:rPr>
-          <w:color w:val="000000" w:themeColor="text1"/>
-        </w:rPr>
-        <w:t>5. Nerede Zorlandım ve Takıldım</w:t>
-      </w:r>
     </w:p>
     <w:p>
       <w:pPr>
@@ -2978,12 +4170,699 @@
         <w:rPr>
           <w:color w:val="000000" w:themeColor="text1"/>
         </w:rPr>
-        <w:t>6. Haftalık Genel Değerlendirme</w:t>
+        <w:t>5. Nerede Zorlandım ve Takıldım</w:t>
       </w:r>
     </w:p>
     <w:p>
       <w:pPr>
-        <w:spacing w:before="200"/>
+        <w:pStyle w:val="Balk1"/>
+        <w:spacing w:before="300" w:after="150"/>
+        <w:rPr>
+          <w:color w:val="000000" w:themeColor="text1"/>
+          <w:sz w:val="22"/>
+          <w:szCs w:val="22"/>
+        </w:rPr>
+      </w:pPr>
+      <w:proofErr w:type="spellStart"/>
+      <w:r>
+        <w:rPr>
+          <w:color w:val="000000" w:themeColor="text1"/>
+          <w:sz w:val="22"/>
+          <w:szCs w:val="22"/>
+        </w:rPr>
+        <w:t>Linked</w:t>
+      </w:r>
+      <w:proofErr w:type="spellEnd"/>
+      <w:r>
+        <w:rPr>
+          <w:color w:val="000000" w:themeColor="text1"/>
+          <w:sz w:val="22"/>
+          <w:szCs w:val="22"/>
+        </w:rPr>
+        <w:t xml:space="preserve"> </w:t>
+      </w:r>
+      <w:proofErr w:type="spellStart"/>
+      <w:r>
+        <w:rPr>
+          <w:color w:val="000000" w:themeColor="text1"/>
+          <w:sz w:val="22"/>
+          <w:szCs w:val="22"/>
+        </w:rPr>
+        <w:t>List'i</w:t>
+      </w:r>
+      <w:proofErr w:type="spellEnd"/>
+      <w:r>
+        <w:rPr>
+          <w:color w:val="000000" w:themeColor="text1"/>
+          <w:sz w:val="22"/>
+          <w:szCs w:val="22"/>
+        </w:rPr>
+        <w:t xml:space="preserve"> ilk yazarken en çok zorlandığım kısım, düğümleri silerken ya da ters çevirirken referansları doğru sırayla güncellemekti. Özellikle </w:t>
+      </w:r>
+      <w:proofErr w:type="spellStart"/>
+      <w:r>
+        <w:rPr>
+          <w:color w:val="000000" w:themeColor="text1"/>
+          <w:sz w:val="22"/>
+          <w:szCs w:val="22"/>
+        </w:rPr>
+        <w:t>reverse</w:t>
+      </w:r>
+      <w:proofErr w:type="spellEnd"/>
+      <w:r>
+        <w:rPr>
+          <w:color w:val="000000" w:themeColor="text1"/>
+          <w:sz w:val="22"/>
+          <w:szCs w:val="22"/>
+        </w:rPr>
+        <w:t xml:space="preserve"> fonksiyonunda bir referansı değiştirmeden önce onu geçici bir değişkende saklamayı unuttuğumda, listenin geri kalanına giden yolu kaybediyordum.</w:t>
+      </w:r>
+    </w:p>
+    <w:p>
+      <w:pPr>
+        <w:pStyle w:val="Balk1"/>
+        <w:spacing w:before="300" w:after="150"/>
+        <w:rPr>
+          <w:color w:val="000000" w:themeColor="text1"/>
+          <w:sz w:val="22"/>
+          <w:szCs w:val="22"/>
+        </w:rPr>
+      </w:pPr>
+      <w:proofErr w:type="spellStart"/>
+      <w:r>
+        <w:rPr>
+          <w:color w:val="000000" w:themeColor="text1"/>
+          <w:sz w:val="22"/>
+          <w:szCs w:val="22"/>
+        </w:rPr>
+        <w:t>Doubly</w:t>
+      </w:r>
+      <w:proofErr w:type="spellEnd"/>
+      <w:r>
+        <w:rPr>
+          <w:color w:val="000000" w:themeColor="text1"/>
+          <w:sz w:val="22"/>
+          <w:szCs w:val="22"/>
+        </w:rPr>
+        <w:t xml:space="preserve"> </w:t>
+      </w:r>
+      <w:proofErr w:type="spellStart"/>
+      <w:r>
+        <w:rPr>
+          <w:color w:val="000000" w:themeColor="text1"/>
+          <w:sz w:val="22"/>
+          <w:szCs w:val="22"/>
+        </w:rPr>
+        <w:t>Linked</w:t>
+      </w:r>
+      <w:proofErr w:type="spellEnd"/>
+      <w:r>
+        <w:rPr>
+          <w:color w:val="000000" w:themeColor="text1"/>
+          <w:sz w:val="22"/>
+          <w:szCs w:val="22"/>
+        </w:rPr>
+        <w:t xml:space="preserve"> </w:t>
+      </w:r>
+      <w:proofErr w:type="spellStart"/>
+      <w:r>
+        <w:rPr>
+          <w:color w:val="000000" w:themeColor="text1"/>
+          <w:sz w:val="22"/>
+          <w:szCs w:val="22"/>
+        </w:rPr>
+        <w:t>List'e</w:t>
+      </w:r>
+      <w:proofErr w:type="spellEnd"/>
+      <w:r>
+        <w:rPr>
+          <w:color w:val="000000" w:themeColor="text1"/>
+          <w:sz w:val="22"/>
+          <w:szCs w:val="22"/>
+        </w:rPr>
+        <w:t xml:space="preserve"> geçince, artık sadece </w:t>
+      </w:r>
+      <w:proofErr w:type="spellStart"/>
+      <w:r>
+        <w:rPr>
+          <w:color w:val="000000" w:themeColor="text1"/>
+          <w:sz w:val="22"/>
+          <w:szCs w:val="22"/>
+        </w:rPr>
+        <w:t>next</w:t>
+      </w:r>
+      <w:proofErr w:type="spellEnd"/>
+      <w:r>
+        <w:rPr>
+          <w:color w:val="000000" w:themeColor="text1"/>
+          <w:sz w:val="22"/>
+          <w:szCs w:val="22"/>
+        </w:rPr>
+        <w:t xml:space="preserve"> değil </w:t>
+      </w:r>
+      <w:proofErr w:type="spellStart"/>
+      <w:r>
+        <w:rPr>
+          <w:color w:val="000000" w:themeColor="text1"/>
+          <w:sz w:val="22"/>
+          <w:szCs w:val="22"/>
+        </w:rPr>
+        <w:t>prev'i</w:t>
+      </w:r>
+      <w:proofErr w:type="spellEnd"/>
+      <w:r>
+        <w:rPr>
+          <w:color w:val="000000" w:themeColor="text1"/>
+          <w:sz w:val="22"/>
+          <w:szCs w:val="22"/>
+        </w:rPr>
+        <w:t xml:space="preserve"> de güncellemem gerektiğini unutup bazı fonksiyonlarda sadece tek yönü güncelleyip diğerini atladığım oldu. </w:t>
+      </w:r>
+      <w:proofErr w:type="spellStart"/>
+      <w:r>
+        <w:rPr>
+          <w:color w:val="000000" w:themeColor="text1"/>
+          <w:sz w:val="22"/>
+          <w:szCs w:val="22"/>
+        </w:rPr>
+        <w:t>Binary</w:t>
+      </w:r>
+      <w:proofErr w:type="spellEnd"/>
+      <w:r>
+        <w:rPr>
+          <w:color w:val="000000" w:themeColor="text1"/>
+          <w:sz w:val="22"/>
+          <w:szCs w:val="22"/>
+        </w:rPr>
+        <w:t xml:space="preserve"> </w:t>
+      </w:r>
+      <w:proofErr w:type="spellStart"/>
+      <w:r>
+        <w:rPr>
+          <w:color w:val="000000" w:themeColor="text1"/>
+          <w:sz w:val="22"/>
+          <w:szCs w:val="22"/>
+        </w:rPr>
+        <w:t>Tree'de</w:t>
+      </w:r>
+      <w:proofErr w:type="spellEnd"/>
+      <w:r>
+        <w:rPr>
+          <w:color w:val="000000" w:themeColor="text1"/>
+          <w:sz w:val="22"/>
+          <w:szCs w:val="22"/>
+        </w:rPr>
+        <w:t xml:space="preserve"> ise </w:t>
+      </w:r>
+      <w:proofErr w:type="spellStart"/>
+      <w:r>
+        <w:rPr>
+          <w:color w:val="000000" w:themeColor="text1"/>
+          <w:sz w:val="22"/>
+          <w:szCs w:val="22"/>
+        </w:rPr>
+        <w:t>recursion</w:t>
+      </w:r>
+      <w:proofErr w:type="spellEnd"/>
+      <w:r>
+        <w:rPr>
+          <w:color w:val="000000" w:themeColor="text1"/>
+          <w:sz w:val="22"/>
+          <w:szCs w:val="22"/>
+        </w:rPr>
+        <w:t xml:space="preserve"> mantığına alışana kadar biraz zorlandım; bir fonksiyonun kendi kendini çağırması ilk başta kafa karıştırıcıydı, ama her çağrının 'daha küçük bir alt ağaç' üzerinde çalıştığını fark edince oturdu.</w:t>
+      </w:r>
+    </w:p>
+    <w:p>
+      <w:pPr>
+        <w:pStyle w:val="Balk1"/>
+        <w:spacing w:before="300" w:after="150"/>
+        <w:rPr>
+          <w:color w:val="000000" w:themeColor="text1"/>
+        </w:rPr>
+      </w:pPr>
+      <w:r>
+        <w:rPr>
+          <w:color w:val="000000" w:themeColor="text1"/>
+        </w:rPr>
+        <w:t>6. Haftalık Genel Değerlendirme</w:t>
+      </w:r>
+    </w:p>
+    <w:p>
+      <w:pPr>
+        <w:pStyle w:val="Balk1"/>
+        <w:spacing w:before="300" w:after="150"/>
+        <w:rPr>
+          <w:color w:val="000000" w:themeColor="text1"/>
+          <w:sz w:val="22"/>
+          <w:szCs w:val="22"/>
+        </w:rPr>
+      </w:pPr>
+      <w:r>
+        <w:rPr>
+          <w:color w:val="000000" w:themeColor="text1"/>
+          <w:sz w:val="22"/>
+          <w:szCs w:val="22"/>
+        </w:rPr>
+        <w:t xml:space="preserve">Bu hafta önce </w:t>
+      </w:r>
+      <w:proofErr w:type="spellStart"/>
+      <w:r>
+        <w:rPr>
+          <w:color w:val="000000" w:themeColor="text1"/>
+          <w:sz w:val="22"/>
+          <w:szCs w:val="22"/>
+        </w:rPr>
+        <w:t>Singly</w:t>
+      </w:r>
+      <w:proofErr w:type="spellEnd"/>
+      <w:r>
+        <w:rPr>
+          <w:color w:val="000000" w:themeColor="text1"/>
+          <w:sz w:val="22"/>
+          <w:szCs w:val="22"/>
+        </w:rPr>
+        <w:t xml:space="preserve"> </w:t>
+      </w:r>
+      <w:proofErr w:type="spellStart"/>
+      <w:r>
+        <w:rPr>
+          <w:color w:val="000000" w:themeColor="text1"/>
+          <w:sz w:val="22"/>
+          <w:szCs w:val="22"/>
+        </w:rPr>
+        <w:t>Linked</w:t>
+      </w:r>
+      <w:proofErr w:type="spellEnd"/>
+      <w:r>
+        <w:rPr>
+          <w:color w:val="000000" w:themeColor="text1"/>
+          <w:sz w:val="22"/>
+          <w:szCs w:val="22"/>
+        </w:rPr>
+        <w:t xml:space="preserve"> </w:t>
+      </w:r>
+      <w:proofErr w:type="spellStart"/>
+      <w:r>
+        <w:rPr>
+          <w:color w:val="000000" w:themeColor="text1"/>
+          <w:sz w:val="22"/>
+          <w:szCs w:val="22"/>
+        </w:rPr>
+        <w:t>List'i</w:t>
+      </w:r>
+      <w:proofErr w:type="spellEnd"/>
+      <w:r>
+        <w:rPr>
+          <w:color w:val="000000" w:themeColor="text1"/>
+          <w:sz w:val="22"/>
+          <w:szCs w:val="22"/>
+        </w:rPr>
+        <w:t xml:space="preserve"> sıfırdan yazdım, sonra onu </w:t>
+      </w:r>
+      <w:proofErr w:type="spellStart"/>
+      <w:r>
+        <w:rPr>
+          <w:color w:val="000000" w:themeColor="text1"/>
+          <w:sz w:val="22"/>
+          <w:szCs w:val="22"/>
+        </w:rPr>
+        <w:t>Doubly</w:t>
+      </w:r>
+      <w:proofErr w:type="spellEnd"/>
+      <w:r>
+        <w:rPr>
+          <w:color w:val="000000" w:themeColor="text1"/>
+          <w:sz w:val="22"/>
+          <w:szCs w:val="22"/>
+        </w:rPr>
+        <w:t xml:space="preserve"> </w:t>
+      </w:r>
+      <w:proofErr w:type="spellStart"/>
+      <w:r>
+        <w:rPr>
+          <w:color w:val="000000" w:themeColor="text1"/>
+          <w:sz w:val="22"/>
+          <w:szCs w:val="22"/>
+        </w:rPr>
+        <w:t>Linked</w:t>
+      </w:r>
+      <w:proofErr w:type="spellEnd"/>
+      <w:r>
+        <w:rPr>
+          <w:color w:val="000000" w:themeColor="text1"/>
+          <w:sz w:val="22"/>
+          <w:szCs w:val="22"/>
+        </w:rPr>
+        <w:t xml:space="preserve"> </w:t>
+      </w:r>
+      <w:proofErr w:type="spellStart"/>
+      <w:r>
+        <w:rPr>
+          <w:color w:val="000000" w:themeColor="text1"/>
+          <w:sz w:val="22"/>
+          <w:szCs w:val="22"/>
+        </w:rPr>
+        <w:t>List'e</w:t>
+      </w:r>
+      <w:proofErr w:type="spellEnd"/>
+      <w:r>
+        <w:rPr>
+          <w:color w:val="000000" w:themeColor="text1"/>
+          <w:sz w:val="22"/>
+          <w:szCs w:val="22"/>
+        </w:rPr>
+        <w:t xml:space="preserve"> dönüştürdüm, ardından </w:t>
+      </w:r>
+      <w:proofErr w:type="spellStart"/>
+      <w:r>
+        <w:rPr>
+          <w:color w:val="000000" w:themeColor="text1"/>
+          <w:sz w:val="22"/>
+          <w:szCs w:val="22"/>
+        </w:rPr>
+        <w:t>Binary</w:t>
+      </w:r>
+      <w:proofErr w:type="spellEnd"/>
+      <w:r>
+        <w:rPr>
+          <w:color w:val="000000" w:themeColor="text1"/>
+          <w:sz w:val="22"/>
+          <w:szCs w:val="22"/>
+        </w:rPr>
+        <w:t xml:space="preserve"> </w:t>
+      </w:r>
+      <w:proofErr w:type="spellStart"/>
+      <w:r>
+        <w:rPr>
+          <w:color w:val="000000" w:themeColor="text1"/>
+          <w:sz w:val="22"/>
+          <w:szCs w:val="22"/>
+        </w:rPr>
+        <w:t>Search</w:t>
+      </w:r>
+      <w:proofErr w:type="spellEnd"/>
+      <w:r>
+        <w:rPr>
+          <w:color w:val="000000" w:themeColor="text1"/>
+          <w:sz w:val="22"/>
+          <w:szCs w:val="22"/>
+        </w:rPr>
+        <w:t xml:space="preserve"> </w:t>
+      </w:r>
+      <w:proofErr w:type="spellStart"/>
+      <w:r>
+        <w:rPr>
+          <w:color w:val="000000" w:themeColor="text1"/>
+          <w:sz w:val="22"/>
+          <w:szCs w:val="22"/>
+        </w:rPr>
+        <w:t>Tree'yi</w:t>
+      </w:r>
+      <w:proofErr w:type="spellEnd"/>
+      <w:r>
+        <w:rPr>
+          <w:color w:val="000000" w:themeColor="text1"/>
+          <w:sz w:val="22"/>
+          <w:szCs w:val="22"/>
+        </w:rPr>
+        <w:t xml:space="preserve"> insert ve üç </w:t>
+      </w:r>
+      <w:proofErr w:type="spellStart"/>
+      <w:r>
+        <w:rPr>
+          <w:color w:val="000000" w:themeColor="text1"/>
+          <w:sz w:val="22"/>
+          <w:szCs w:val="22"/>
+        </w:rPr>
+        <w:t>traversal</w:t>
+      </w:r>
+      <w:proofErr w:type="spellEnd"/>
+      <w:r>
+        <w:rPr>
+          <w:color w:val="000000" w:themeColor="text1"/>
+          <w:sz w:val="22"/>
+          <w:szCs w:val="22"/>
+        </w:rPr>
+        <w:t xml:space="preserve"> metoduyla (</w:t>
+      </w:r>
+      <w:proofErr w:type="spellStart"/>
+      <w:r>
+        <w:rPr>
+          <w:color w:val="000000" w:themeColor="text1"/>
+          <w:sz w:val="22"/>
+          <w:szCs w:val="22"/>
+        </w:rPr>
+        <w:t>inorder</w:t>
+      </w:r>
+      <w:proofErr w:type="spellEnd"/>
+      <w:r>
+        <w:rPr>
+          <w:color w:val="000000" w:themeColor="text1"/>
+          <w:sz w:val="22"/>
+          <w:szCs w:val="22"/>
+        </w:rPr>
+        <w:t xml:space="preserve">, </w:t>
+      </w:r>
+      <w:proofErr w:type="spellStart"/>
+      <w:r>
+        <w:rPr>
+          <w:color w:val="000000" w:themeColor="text1"/>
+          <w:sz w:val="22"/>
+          <w:szCs w:val="22"/>
+        </w:rPr>
+        <w:t>preorder</w:t>
+      </w:r>
+      <w:proofErr w:type="spellEnd"/>
+      <w:r>
+        <w:rPr>
+          <w:color w:val="000000" w:themeColor="text1"/>
+          <w:sz w:val="22"/>
+          <w:szCs w:val="22"/>
+        </w:rPr>
+        <w:t xml:space="preserve">, </w:t>
+      </w:r>
+      <w:proofErr w:type="spellStart"/>
+      <w:r>
+        <w:rPr>
+          <w:color w:val="000000" w:themeColor="text1"/>
+          <w:sz w:val="22"/>
+          <w:szCs w:val="22"/>
+        </w:rPr>
+        <w:t>postorder</w:t>
+      </w:r>
+      <w:proofErr w:type="spellEnd"/>
+      <w:r>
+        <w:rPr>
+          <w:color w:val="000000" w:themeColor="text1"/>
+          <w:sz w:val="22"/>
+          <w:szCs w:val="22"/>
+        </w:rPr>
+        <w:t xml:space="preserve">) tamamladım. </w:t>
+      </w:r>
+      <w:proofErr w:type="spellStart"/>
+      <w:r>
+        <w:rPr>
+          <w:color w:val="000000" w:themeColor="text1"/>
+          <w:sz w:val="22"/>
+          <w:szCs w:val="22"/>
+        </w:rPr>
+        <w:t>LeetCode</w:t>
+      </w:r>
+      <w:proofErr w:type="spellEnd"/>
+      <w:r>
+        <w:rPr>
+          <w:color w:val="000000" w:themeColor="text1"/>
+          <w:sz w:val="22"/>
+          <w:szCs w:val="22"/>
+        </w:rPr>
+        <w:t xml:space="preserve"> tarafında planın istediği 2 </w:t>
+      </w:r>
+      <w:proofErr w:type="spellStart"/>
+      <w:r>
+        <w:rPr>
+          <w:color w:val="000000" w:themeColor="text1"/>
+          <w:sz w:val="22"/>
+          <w:szCs w:val="22"/>
+        </w:rPr>
+        <w:t>Linked</w:t>
+      </w:r>
+      <w:proofErr w:type="spellEnd"/>
+      <w:r>
+        <w:rPr>
+          <w:color w:val="000000" w:themeColor="text1"/>
+          <w:sz w:val="22"/>
+          <w:szCs w:val="22"/>
+        </w:rPr>
+        <w:t xml:space="preserve"> </w:t>
+      </w:r>
+      <w:proofErr w:type="spellStart"/>
+      <w:r>
+        <w:rPr>
+          <w:color w:val="000000" w:themeColor="text1"/>
+          <w:sz w:val="22"/>
+          <w:szCs w:val="22"/>
+        </w:rPr>
+        <w:t>List</w:t>
+      </w:r>
+      <w:proofErr w:type="spellEnd"/>
+      <w:r>
+        <w:rPr>
+          <w:color w:val="000000" w:themeColor="text1"/>
+          <w:sz w:val="22"/>
+          <w:szCs w:val="22"/>
+        </w:rPr>
+        <w:t xml:space="preserve"> + 1 </w:t>
+      </w:r>
+      <w:proofErr w:type="spellStart"/>
+      <w:r>
+        <w:rPr>
+          <w:color w:val="000000" w:themeColor="text1"/>
+          <w:sz w:val="22"/>
+          <w:szCs w:val="22"/>
+        </w:rPr>
+        <w:t>Tree</w:t>
+      </w:r>
+      <w:proofErr w:type="spellEnd"/>
+      <w:r>
+        <w:rPr>
+          <w:color w:val="000000" w:themeColor="text1"/>
+          <w:sz w:val="22"/>
+          <w:szCs w:val="22"/>
+        </w:rPr>
+        <w:t xml:space="preserve"> problemini çözdüm ve iki işaretçi, </w:t>
+      </w:r>
+      <w:proofErr w:type="spellStart"/>
+      <w:r>
+        <w:rPr>
+          <w:color w:val="000000" w:themeColor="text1"/>
+          <w:sz w:val="22"/>
+          <w:szCs w:val="22"/>
+        </w:rPr>
+        <w:t>dummy</w:t>
+      </w:r>
+      <w:proofErr w:type="spellEnd"/>
+      <w:r>
+        <w:rPr>
+          <w:color w:val="000000" w:themeColor="text1"/>
+          <w:sz w:val="22"/>
+          <w:szCs w:val="22"/>
+        </w:rPr>
+        <w:t xml:space="preserve"> </w:t>
+      </w:r>
+      <w:proofErr w:type="spellStart"/>
+      <w:r>
+        <w:rPr>
+          <w:color w:val="000000" w:themeColor="text1"/>
+          <w:sz w:val="22"/>
+          <w:szCs w:val="22"/>
+        </w:rPr>
+        <w:t>node</w:t>
+      </w:r>
+      <w:proofErr w:type="spellEnd"/>
+      <w:r>
+        <w:rPr>
+          <w:color w:val="000000" w:themeColor="text1"/>
+          <w:sz w:val="22"/>
+          <w:szCs w:val="22"/>
+        </w:rPr>
+        <w:t xml:space="preserve"> gibi tekniklerle tanıştım. Ayrıca </w:t>
+      </w:r>
+      <w:proofErr w:type="spellStart"/>
+      <w:r>
+        <w:rPr>
+          <w:color w:val="000000" w:themeColor="text1"/>
+          <w:sz w:val="22"/>
+          <w:szCs w:val="22"/>
+        </w:rPr>
+        <w:t>linked</w:t>
+      </w:r>
+      <w:proofErr w:type="spellEnd"/>
+      <w:r>
+        <w:rPr>
+          <w:color w:val="000000" w:themeColor="text1"/>
+          <w:sz w:val="22"/>
+          <w:szCs w:val="22"/>
+        </w:rPr>
+        <w:t xml:space="preserve"> </w:t>
+      </w:r>
+      <w:proofErr w:type="spellStart"/>
+      <w:r>
+        <w:rPr>
+          <w:color w:val="000000" w:themeColor="text1"/>
+          <w:sz w:val="22"/>
+          <w:szCs w:val="22"/>
+        </w:rPr>
+        <w:t>list'ler</w:t>
+      </w:r>
+      <w:proofErr w:type="spellEnd"/>
+      <w:r>
+        <w:rPr>
+          <w:color w:val="000000" w:themeColor="text1"/>
+          <w:sz w:val="22"/>
+          <w:szCs w:val="22"/>
+        </w:rPr>
+        <w:t xml:space="preserve"> üzerine bir makale okuyup özetledim. Hafta 3 planındaki tüm görevleri tamamlamış </w:t>
+      </w:r>
+      <w:proofErr w:type="spellStart"/>
+      <w:proofErr w:type="gramStart"/>
+      <w:r>
+        <w:rPr>
+          <w:color w:val="000000" w:themeColor="text1"/>
+          <w:sz w:val="22"/>
+          <w:szCs w:val="22"/>
+        </w:rPr>
+        <w:t>oldum</w:t>
+      </w:r>
+      <w:r>
+        <w:rPr>
+          <w:color w:val="000000" w:themeColor="text1"/>
+          <w:sz w:val="22"/>
+          <w:szCs w:val="22"/>
+        </w:rPr>
+        <w:t>.E</w:t>
+      </w:r>
+      <w:r>
+        <w:rPr>
+          <w:color w:val="000000" w:themeColor="text1"/>
+          <w:sz w:val="22"/>
+          <w:szCs w:val="22"/>
+        </w:rPr>
+        <w:t>n</w:t>
+      </w:r>
+      <w:proofErr w:type="spellEnd"/>
+      <w:proofErr w:type="gramEnd"/>
+      <w:r>
+        <w:rPr>
+          <w:color w:val="000000" w:themeColor="text1"/>
+          <w:sz w:val="22"/>
+          <w:szCs w:val="22"/>
+        </w:rPr>
+        <w:t xml:space="preserve"> çok öğrendiğim şey, veri yapılarında referansları doğru yönetmenin ve </w:t>
+      </w:r>
+      <w:proofErr w:type="spellStart"/>
+      <w:r>
+        <w:rPr>
+          <w:color w:val="000000" w:themeColor="text1"/>
+          <w:sz w:val="22"/>
+          <w:szCs w:val="22"/>
+        </w:rPr>
+        <w:t>recursive</w:t>
+      </w:r>
+      <w:proofErr w:type="spellEnd"/>
+      <w:r>
+        <w:rPr>
+          <w:color w:val="000000" w:themeColor="text1"/>
+          <w:sz w:val="22"/>
+          <w:szCs w:val="22"/>
+        </w:rPr>
+        <w:t xml:space="preserve"> düşünmenin pratikle netleştiği oldu.</w:t>
+      </w:r>
+    </w:p>
+    <w:p>
+      <w:pPr>
+        <w:pStyle w:val="Balk1"/>
+        <w:spacing w:before="300" w:after="150"/>
         <w:rPr>
           <w:color w:val="000000" w:themeColor="text1"/>
         </w:rPr>
@@ -3030,6 +4909,27 @@
 <file path=word/numbering.xml><?xml version="1.0" encoding="utf-8"?>
 <w:numbering xmlns:wpc="http://schemas.microsoft.com/office/word/2010/wordprocessingCanvas" xmlns:cx="http://schemas.microsoft.com/office/drawing/2014/chartex" xmlns:cx1="http://schemas.microsoft.com/office/drawing/2015/9/8/chartex" xmlns:cx2="http://schemas.microsoft.com/office/drawing/2015/10/21/chartex" xmlns:cx3="http://schemas.microsoft.com/office/drawing/2016/5/9/chartex" xmlns:cx4="http://schemas.microsoft.com/office/drawing/2016/5/10/chartex" xmlns:cx5="http://schemas.microsoft.com/office/drawing/2016/5/11/chartex" xmlns:cx6="http://schemas.microsoft.com/office/drawing/2016/5/12/chartex" xmlns:cx7="http://schemas.microsoft.com/office/drawing/2016/5/13/chartex" xmlns:cx8="http://schemas.microsoft.com/office/drawing/2016/5/14/chartex" xmlns:mc="http://schemas.openxmlformats.org/markup-compatibility/2006" xmlns:aink="http://schemas.microsoft.com/office/drawing/2016/ink" xmlns:am3d="http://schemas.microsoft.com/office/drawing/2017/model3d" xmlns:o="urn:schemas-microsoft-com:office:office" xmlns:oel="http://schemas.microsoft.com/office/2019/extlst" xmlns:r="http://schemas.openxmlformats.org/officeDocument/2006/relationships" xmlns:m="http://schemas.openxmlformats.org/officeDocument/2006/math" xmlns:v="urn:schemas-microsoft-com:vml" xmlns:wp14="http://schemas.microsoft.com/office/word/2010/wordprocessingDrawing" xmlns:wp="http://schemas.openxmlformats.org/drawingml/2006/wordprocessingDrawing" xmlns:w10="urn:schemas-microsoft-com:office:word" xmlns:w="http://schemas.openxmlformats.org/wordprocessingml/2006/main" xmlns:w14="http://schemas.microsoft.com/office/word/2010/wordml" xmlns:w15="http://schemas.microsoft.com/office/word/2012/wordml" xmlns:w16cex="http://schemas.microsoft.com/office/word/2018/wordml/cex" xmlns:w16cid="http://schemas.microsoft.com/office/word/2016/wordml/cid" xmlns:w16="http://schemas.microsoft.com/office/word/2018/wordml" xmlns:w16du="http://schemas.microsoft.com/office/word/2023/wordml/word16du" xmlns:w16sdtdh="http://schemas.microsoft.com/office/word/2020/wordml/sdtdatahash" xmlns:w16sdtfl="http://schemas.microsoft.com/office/word/2024/wordml/sdtformatlock" xmlns:w16se="http://schemas.microsoft.com/office/word/2015/wordml/symex" xmlns:wpg="http://schemas.microsoft.com/office/word/2010/wordprocessingGroup" xmlns:wpi="http://schemas.microsoft.com/office/word/2010/wordprocessingInk" xmlns:wne="http://schemas.microsoft.com/office/word/2006/wordml" xmlns:wps="http://schemas.microsoft.com/office/word/2010/wordprocessingShape" mc:Ignorable="w14 w15 w16se w16cid w16 w16cex w16sdtdh w16sdtfl w16du wp14">
   <w:abstractNum w:abstractNumId="0" w15:restartNumberingAfterBreak="0">
+    <w:nsid w:val="FFFFFF89"/>
+    <w:multiLevelType w:val="singleLevel"/>
+    <w:tmpl w:val="1ABA9C4A"/>
+    <w:lvl w:ilvl="0">
+      <w:start w:val="1"/>
+      <w:numFmt w:val="bullet"/>
+      <w:pStyle w:val="ListeMaddemi"/>
+      <w:lvlText w:val=""/>
+      <w:lvlJc w:val="left"/>
+      <w:pPr>
+        <w:tabs>
+          <w:tab w:val="num" w:pos="360"/>
+        </w:tabs>
+        <w:ind w:left="360" w:hanging="360"/>
+      </w:pPr>
+      <w:rPr>
+        <w:rFonts w:ascii="Symbol" w:hAnsi="Symbol" w:hint="default"/>
+      </w:rPr>
+    </w:lvl>
+  </w:abstractNum>
+  <w:abstractNum w:abstractNumId="1" w15:restartNumberingAfterBreak="0">
     <w:nsid w:val="3D2D3AEA"/>
     <w:multiLevelType w:val="hybridMultilevel"/>
     <w:tmpl w:val="5568E572"/>
@@ -3116,10 +5016,13 @@
     </w:lvl>
   </w:abstractNum>
   <w:num w:numId="1" w16cid:durableId="2014527660">
-    <w:abstractNumId w:val="0"/>
+    <w:abstractNumId w:val="1"/>
     <w:lvlOverride w:ilvl="0">
       <w:startOverride w:val="1"/>
     </w:lvlOverride>
+  </w:num>
+  <w:num w:numId="2" w16cid:durableId="1961839500">
+    <w:abstractNumId w:val="0"/>
   </w:num>
 </w:numbering>
 </file>
@@ -3516,6 +5419,7 @@
   <w:style w:type="paragraph" w:default="1" w:styleId="Normal">
     <w:name w:val="Normal"/>
     <w:qFormat/>
+    <w:rsid w:val="00516745"/>
   </w:style>
   <w:style w:type="paragraph" w:styleId="Balk1">
     <w:name w:val="heading 1"/>
@@ -3603,7 +5507,6 @@
   <w:style w:type="character" w:default="1" w:styleId="VarsaylanParagrafYazTipi">
     <w:name w:val="Default Paragraph Font"/>
     <w:uiPriority w:val="1"/>
-    <w:semiHidden/>
     <w:unhideWhenUsed/>
   </w:style>
   <w:style w:type="table" w:default="1" w:styleId="NormalTablo">
@@ -3734,6 +5637,19 @@
       <w:color w:val="954F72" w:themeColor="followedHyperlink"/>
       <w:u w:val="single"/>
     </w:rPr>
+  </w:style>
+  <w:style w:type="paragraph" w:styleId="ListeMaddemi">
+    <w:name w:val="List Bullet"/>
+    <w:basedOn w:val="Normal"/>
+    <w:uiPriority w:val="99"/>
+    <w:unhideWhenUsed/>
+    <w:rsid w:val="00C42D7D"/>
+    <w:pPr>
+      <w:numPr>
+        <w:numId w:val="2"/>
+      </w:numPr>
+      <w:contextualSpacing/>
+    </w:pPr>
   </w:style>
 </w:styles>
 </file>

</xml_diff>